<commit_message>
Phase 13X: Unit 1 + Unit 2 assessment blueprint and final test rebuild
Co-authored-by: Cursor <cursoragent@cursor.com>
</commit_message>
<xml_diff>
--- a/production/quizzes/07-unit-final-assessment.docx
+++ b/production/quizzes/07-unit-final-assessment.docx
@@ -4,295 +4,904 @@
   <w:body>
     <w:p>
       <w:pPr>
-        <w:spacing w:before="0" w:after="0"/>
+        <w:spacing w:after="40" w:before="0"/>
+        <w:jc w:val="center"/>
       </w:pPr>
       <w:r>
         <w:rPr>
           <w:rFonts w:ascii="Calibri" w:hAnsi="Calibri"/>
           <w:b/>
-          <w:i w:val="0"/>
-          <w:color w:val="1A1A1A"/>
-          <w:sz w:val="44"/>
+          <w:sz w:val="40"/>
         </w:rPr>
-        <w:t>Unit Final Assessment</w:t>
+        <w:t>Grade 4 Science</w:t>
       </w:r>
     </w:p>
     <w:p>
       <w:pPr>
-        <w:spacing w:before="0" w:after="40"/>
+        <w:spacing w:after="100" w:before="0"/>
+        <w:jc w:val="center"/>
+      </w:pPr>
+      <w:r>
+        <w:rPr>
+          <w:rFonts w:ascii="Calibri" w:hAnsi="Calibri"/>
+          <w:b/>
+          <w:sz w:val="30"/>
+        </w:rPr>
+        <w:t>Unit 1 Assessment — Energy Transfer &amp; Transformation</w:t>
+      </w:r>
+    </w:p>
+    <w:p>
+      <w:pPr>
+        <w:spacing w:after="120" w:before="0"/>
       </w:pPr>
       <w:r>
         <w:rPr>
           <w:rFonts w:ascii="Calibri" w:hAnsi="Calibri"/>
           <w:b w:val="0"/>
-          <w:i w:val="0"/>
-          <w:color w:val="555555"/>
-          <w:sz w:val="24"/>
+          <w:sz w:val="26"/>
         </w:rPr>
-        <w:t>What Have I Learned About Energy?</w:t>
+        <w:t>Name: ________________________________    HR:   4A    4B    4C    4D</w:t>
       </w:r>
     </w:p>
     <w:p>
       <w:pPr>
-        <w:spacing w:before="0" w:after="80"/>
+        <w:spacing w:after="120" w:before="0"/>
       </w:pPr>
       <w:r>
         <w:rPr>
           <w:rFonts w:ascii="Calibri" w:hAnsi="Calibri"/>
           <w:b w:val="0"/>
-          <w:i/>
-          <w:color w:val="555555"/>
-          <w:sz w:val="24"/>
+          <w:sz w:val="26"/>
         </w:rPr>
-        <w:t>Grade 4 Energy Transfer &amp; Transformation · 26 items · 50 points</w:t>
+        <w:t>Directions: Read each question and choose the ONE BEST ANSWER.</w:t>
       </w:r>
     </w:p>
     <w:p>
       <w:pPr>
-        <w:spacing w:before="0" w:after="160"/>
+        <w:spacing w:after="80" w:before="0"/>
+      </w:pPr>
+      <w:r>
+        <w:rPr>
+          <w:rFonts w:ascii="Calibri" w:hAnsi="Calibri"/>
+          <w:b/>
+          <w:sz w:val="32"/>
+        </w:rPr>
+        <w:t>Part 1: Matching (Questions 1–8)</w:t>
+      </w:r>
+    </w:p>
+    <w:p>
+      <w:pPr>
+        <w:spacing w:after="100" w:before="0"/>
       </w:pPr>
       <w:r>
         <w:rPr>
           <w:rFonts w:ascii="Calibri" w:hAnsi="Calibri"/>
           <w:b w:val="0"/>
-          <w:i w:val="0"/>
-          <w:color w:val="1A1A1A"/>
-          <w:sz w:val="24"/>
-        </w:rPr>
-        <w:t>Name: ____________________________    Date: ________________</w:t>
-      </w:r>
-    </w:p>
-    <w:p>
-      <w:pPr>
-        <w:spacing w:before="0" w:after="160"/>
-      </w:pPr>
-      <w:r>
-        <w:rPr>
-          <w:rFonts w:ascii="Calibri" w:hAnsi="Calibri"/>
-          <w:b w:val="0"/>
-          <w:i w:val="0"/>
-          <w:color w:val="1A1A1A"/>
-          <w:sz w:val="24"/>
-        </w:rPr>
-        <w:t>Directions: Read each item carefully. Show your evidence. You may use your Core Vocabulary cards.</w:t>
-      </w:r>
-    </w:p>
-    <w:p>
-      <w:pPr>
-        <w:spacing w:before="160" w:after="40"/>
-      </w:pPr>
-      <w:r>
-        <w:rPr>
-          <w:rFonts w:ascii="Calibri" w:hAnsi="Calibri"/>
-          <w:b/>
-          <w:i w:val="0"/>
-          <w:color w:val="1F3A5F"/>
           <w:sz w:val="26"/>
         </w:rPr>
-        <w:t>Section 1 — Energy Causes Change</w:t>
-      </w:r>
-    </w:p>
-    <w:p>
-      <w:pPr>
-        <w:spacing w:before="120" w:after="40"/>
-      </w:pPr>
-      <w:r>
-        <w:rPr>
-          <w:rFonts w:ascii="Calibri" w:hAnsi="Calibri"/>
-          <w:b/>
-          <w:i w:val="0"/>
-          <w:color w:val="1A1A1A"/>
-          <w:sz w:val="24"/>
-        </w:rPr>
-        <w:t>1. Which show evidence of energy causing a change? Circle ALL correct answers.</w:t>
-      </w:r>
-    </w:p>
-    <w:p>
-      <w:pPr>
-        <w:spacing w:before="0" w:after="20"/>
-      </w:pPr>
-      <w:r>
-        <w:rPr>
-          <w:rFonts w:ascii="Calibri" w:hAnsi="Calibri"/>
-          <w:b w:val="0"/>
-          <w:i w:val="0"/>
-          <w:color w:val="1A1A1A"/>
-          <w:sz w:val="24"/>
-        </w:rPr>
-        <w:t xml:space="preserve">    a) A basketball hits the backboard.</w:t>
-      </w:r>
-    </w:p>
-    <w:p>
-      <w:pPr>
-        <w:spacing w:before="0" w:after="20"/>
-      </w:pPr>
-      <w:r>
-        <w:rPr>
-          <w:rFonts w:ascii="Calibri" w:hAnsi="Calibri"/>
-          <w:b w:val="0"/>
-          <w:i w:val="0"/>
-          <w:color w:val="1A1A1A"/>
-          <w:sz w:val="24"/>
-        </w:rPr>
-        <w:t xml:space="preserve">    b) You get a small shock from a doorknob.</w:t>
-      </w:r>
-    </w:p>
-    <w:p>
-      <w:pPr>
-        <w:spacing w:before="0" w:after="20"/>
-      </w:pPr>
-      <w:r>
-        <w:rPr>
-          <w:rFonts w:ascii="Calibri" w:hAnsi="Calibri"/>
-          <w:b w:val="0"/>
-          <w:i w:val="0"/>
-          <w:color w:val="1A1A1A"/>
-          <w:sz w:val="24"/>
-        </w:rPr>
-        <w:t xml:space="preserve">    c) The school bus engine makes a sound when it starts.</w:t>
-      </w:r>
-    </w:p>
-    <w:p>
-      <w:pPr>
-        <w:spacing w:before="0" w:after="20"/>
-      </w:pPr>
-      <w:r>
-        <w:rPr>
-          <w:rFonts w:ascii="Calibri" w:hAnsi="Calibri"/>
-          <w:b w:val="0"/>
-          <w:i w:val="0"/>
-          <w:color w:val="1A1A1A"/>
-          <w:sz w:val="24"/>
-        </w:rPr>
-        <w:t xml:space="preserve">    d) A candle flame lights up a dark room.</w:t>
-      </w:r>
-    </w:p>
-    <w:p>
-      <w:pPr>
-        <w:spacing w:before="120" w:after="40"/>
-      </w:pPr>
-      <w:r>
-        <w:rPr>
-          <w:rFonts w:ascii="Calibri" w:hAnsi="Calibri"/>
-          <w:b/>
-          <w:i w:val="0"/>
-          <w:color w:val="1A1A1A"/>
-          <w:sz w:val="24"/>
-        </w:rPr>
-        <w:t>2. Energy is the ability to ______.</w:t>
-      </w:r>
-    </w:p>
-    <w:p>
-      <w:pPr>
-        <w:spacing w:before="0" w:after="20"/>
-      </w:pPr>
-      <w:r>
-        <w:rPr>
-          <w:rFonts w:ascii="Calibri" w:hAnsi="Calibri"/>
-          <w:b w:val="0"/>
-          <w:i w:val="0"/>
-          <w:color w:val="1A1A1A"/>
-          <w:sz w:val="24"/>
-        </w:rPr>
-        <w:t xml:space="preserve">    a) stay still</w:t>
-      </w:r>
-    </w:p>
-    <w:p>
-      <w:pPr>
-        <w:spacing w:before="0" w:after="20"/>
-      </w:pPr>
-      <w:r>
-        <w:rPr>
-          <w:rFonts w:ascii="Calibri" w:hAnsi="Calibri"/>
-          <w:b w:val="0"/>
-          <w:i w:val="0"/>
-          <w:color w:val="1A1A1A"/>
-          <w:sz w:val="24"/>
-        </w:rPr>
-        <w:t xml:space="preserve">    b) cause change</w:t>
-      </w:r>
-    </w:p>
-    <w:p>
-      <w:pPr>
-        <w:spacing w:before="0" w:after="20"/>
-      </w:pPr>
-      <w:r>
-        <w:rPr>
-          <w:rFonts w:ascii="Calibri" w:hAnsi="Calibri"/>
-          <w:b w:val="0"/>
-          <w:i w:val="0"/>
-          <w:color w:val="1A1A1A"/>
-          <w:sz w:val="24"/>
-        </w:rPr>
-        <w:t xml:space="preserve">    c) make heat only</w:t>
-      </w:r>
-    </w:p>
-    <w:p>
-      <w:pPr>
-        <w:spacing w:before="0" w:after="20"/>
-      </w:pPr>
-      <w:r>
-        <w:rPr>
-          <w:rFonts w:ascii="Calibri" w:hAnsi="Calibri"/>
-          <w:b w:val="0"/>
-          <w:i w:val="0"/>
-          <w:color w:val="1A1A1A"/>
-          <w:sz w:val="24"/>
-        </w:rPr>
-        <w:t xml:space="preserve">    d) be invisible</w:t>
-      </w:r>
-    </w:p>
-    <w:p>
-      <w:pPr>
-        <w:spacing w:before="120" w:after="40"/>
-      </w:pPr>
-      <w:r>
-        <w:rPr>
-          <w:rFonts w:ascii="Calibri" w:hAnsi="Calibri"/>
-          <w:b/>
-          <w:i w:val="0"/>
-          <w:color w:val="1A1A1A"/>
-          <w:sz w:val="24"/>
-        </w:rPr>
-        <w:t>3. Draw a model of energy causing a change. Show a BEFORE and an AFTER. Label the type of energy. Write one sentence describing the change.</w:t>
+        <w:t>Write the letter of the definition that matches each word.</w:t>
       </w:r>
     </w:p>
     <w:tbl>
       <w:tblPr>
         <w:tblW w:type="auto" w:w="0"/>
         <w:jc w:val="center"/>
+        <w:tblLayout w:type="fixed"/>
         <w:tblLook w:firstColumn="1" w:firstRow="1" w:lastColumn="0" w:lastRow="0" w:noHBand="0" w:noVBand="1" w:val="04A0"/>
       </w:tblPr>
       <w:tblGrid>
-        <w:gridCol w:w="10512"/>
+        <w:gridCol w:w="4968"/>
+        <w:gridCol w:w="4968"/>
       </w:tblGrid>
       <w:tr>
-        <w:trPr>
-          <w:trHeight w:val="2304" w:hRule="atLeast"/>
-        </w:trPr>
         <w:tc>
           <w:tcPr>
-            <w:tcW w:type="dxa" w:w="9216"/>
-            <w:tcBorders>
-              <w:top w:val="dashed" w:sz="8" w:color="999999"/>
-              <w:left w:val="dashed" w:sz="8" w:color="999999"/>
-              <w:bottom w:val="dashed" w:sz="8" w:color="999999"/>
-              <w:right w:val="dashed" w:sz="8" w:color="999999"/>
-            </w:tcBorders>
+            <w:tcW w:type="dxa" w:w="3744"/>
+            <w:tcMar>
+              <w:top w:w="20" w:type="dxa"/>
+              <w:bottom w:w="20" w:type="dxa"/>
+              <w:start w:w="80" w:type="dxa"/>
+              <w:end w:w="80" w:type="dxa"/>
+            </w:tcMar>
           </w:tcPr>
           <w:p>
             <w:pPr>
-              <w:jc w:val="center"/>
+              <w:spacing w:after="40" w:before="40"/>
+            </w:pPr>
+            <w:r>
+              <w:rPr>
+                <w:rFonts w:ascii="Calibri" w:hAnsi="Calibri"/>
+                <w:b/>
+                <w:sz w:val="26"/>
+              </w:rPr>
+              <w:t>Vocabulary</w:t>
+            </w:r>
+          </w:p>
+        </w:tc>
+        <w:tc>
+          <w:tcPr>
+            <w:tcW w:type="dxa" w:w="6048"/>
+            <w:tcMar>
+              <w:top w:w="20" w:type="dxa"/>
+              <w:bottom w:w="20" w:type="dxa"/>
+              <w:start w:w="80" w:type="dxa"/>
+              <w:end w:w="80" w:type="dxa"/>
+            </w:tcMar>
+          </w:tcPr>
+          <w:p>
+            <w:pPr>
+              <w:spacing w:after="40" w:before="40"/>
+            </w:pPr>
+            <w:r>
+              <w:rPr>
+                <w:rFonts w:ascii="Calibri" w:hAnsi="Calibri"/>
+                <w:b/>
+                <w:sz w:val="26"/>
+              </w:rPr>
+              <w:t>Definitions</w:t>
+            </w:r>
+          </w:p>
+        </w:tc>
+      </w:tr>
+      <w:tr>
+        <w:tc>
+          <w:tcPr>
+            <w:tcW w:type="dxa" w:w="3744"/>
+            <w:tcMar>
+              <w:top w:w="20" w:type="dxa"/>
+              <w:bottom w:w="20" w:type="dxa"/>
+              <w:start w:w="80" w:type="dxa"/>
+              <w:end w:w="80" w:type="dxa"/>
+            </w:tcMar>
+          </w:tcPr>
+          <w:p>
+            <w:pPr>
+              <w:spacing w:after="40" w:before="40"/>
             </w:pPr>
             <w:r>
               <w:rPr>
                 <w:rFonts w:ascii="Calibri" w:hAnsi="Calibri"/>
                 <w:b w:val="0"/>
-                <w:i/>
-                <w:color w:val="555555"/>
-                <w:sz w:val="24"/>
+                <w:sz w:val="27"/>
               </w:rPr>
-              <w:t>BEFORE  →  AFTER</w:t>
+              <w:t xml:space="preserve">1. </w:t>
+            </w:r>
+            <w:r>
+              <w:rPr>
+                <w:rFonts w:ascii="Calibri" w:hAnsi="Calibri"/>
+                <w:b w:val="0"/>
+                <w:sz w:val="27"/>
+              </w:rPr>
+              <w:t>____</w:t>
+            </w:r>
+            <w:r>
+              <w:rPr>
+                <w:rFonts w:ascii="Calibri" w:hAnsi="Calibri"/>
+                <w:b/>
+                <w:sz w:val="27"/>
+              </w:rPr>
+              <w:t xml:space="preserve"> Energy Transfer</w:t>
+            </w:r>
+          </w:p>
+        </w:tc>
+        <w:tc>
+          <w:tcPr>
+            <w:tcW w:type="dxa" w:w="6048"/>
+            <w:tcMar>
+              <w:top w:w="20" w:type="dxa"/>
+              <w:bottom w:w="20" w:type="dxa"/>
+              <w:start w:w="80" w:type="dxa"/>
+              <w:end w:w="80" w:type="dxa"/>
+            </w:tcMar>
+          </w:tcPr>
+          <w:p>
+            <w:pPr>
+              <w:spacing w:after="40" w:before="40"/>
+            </w:pPr>
+            <w:r>
+              <w:rPr>
+                <w:rFonts w:ascii="Calibri" w:hAnsi="Calibri"/>
+                <w:b/>
+                <w:sz w:val="26"/>
+              </w:rPr>
+              <w:t>A.</w:t>
+            </w:r>
+            <w:r>
+              <w:rPr>
+                <w:rFonts w:ascii="Calibri" w:hAnsi="Calibri"/>
+                <w:b w:val="0"/>
+                <w:sz w:val="26"/>
+              </w:rPr>
+              <w:t xml:space="preserve"> The things that limit what can be used in a design.</w:t>
+            </w:r>
+          </w:p>
+        </w:tc>
+      </w:tr>
+      <w:tr>
+        <w:tc>
+          <w:tcPr>
+            <w:tcW w:type="dxa" w:w="3744"/>
+            <w:tcMar>
+              <w:top w:w="20" w:type="dxa"/>
+              <w:bottom w:w="20" w:type="dxa"/>
+              <w:start w:w="80" w:type="dxa"/>
+              <w:end w:w="80" w:type="dxa"/>
+            </w:tcMar>
+          </w:tcPr>
+          <w:p>
+            <w:pPr>
+              <w:spacing w:after="40" w:before="40"/>
+            </w:pPr>
+            <w:r>
+              <w:rPr>
+                <w:rFonts w:ascii="Calibri" w:hAnsi="Calibri"/>
+                <w:b w:val="0"/>
+                <w:sz w:val="27"/>
+              </w:rPr>
+              <w:t xml:space="preserve">2. </w:t>
+            </w:r>
+            <w:r>
+              <w:rPr>
+                <w:rFonts w:ascii="Calibri" w:hAnsi="Calibri"/>
+                <w:b w:val="0"/>
+                <w:sz w:val="27"/>
+              </w:rPr>
+              <w:t>____</w:t>
+            </w:r>
+            <w:r>
+              <w:rPr>
+                <w:rFonts w:ascii="Calibri" w:hAnsi="Calibri"/>
+                <w:b/>
+                <w:sz w:val="27"/>
+              </w:rPr>
+              <w:t xml:space="preserve"> Stored Energy</w:t>
+            </w:r>
+          </w:p>
+        </w:tc>
+        <w:tc>
+          <w:tcPr>
+            <w:tcW w:type="dxa" w:w="6048"/>
+            <w:tcMar>
+              <w:top w:w="20" w:type="dxa"/>
+              <w:bottom w:w="20" w:type="dxa"/>
+              <w:start w:w="80" w:type="dxa"/>
+              <w:end w:w="80" w:type="dxa"/>
+            </w:tcMar>
+          </w:tcPr>
+          <w:p>
+            <w:pPr>
+              <w:spacing w:after="40" w:before="40"/>
+            </w:pPr>
+            <w:r>
+              <w:rPr>
+                <w:rFonts w:ascii="Calibri" w:hAnsi="Calibri"/>
+                <w:b/>
+                <w:sz w:val="26"/>
+              </w:rPr>
+              <w:t>B.</w:t>
+            </w:r>
+            <w:r>
+              <w:rPr>
+                <w:rFonts w:ascii="Calibri" w:hAnsi="Calibri"/>
+                <w:b w:val="0"/>
+                <w:sz w:val="26"/>
+              </w:rPr>
+              <w:t xml:space="preserve"> The ability to cause change.</w:t>
+            </w:r>
+          </w:p>
+        </w:tc>
+      </w:tr>
+      <w:tr>
+        <w:tc>
+          <w:tcPr>
+            <w:tcW w:type="dxa" w:w="3744"/>
+            <w:tcMar>
+              <w:top w:w="20" w:type="dxa"/>
+              <w:bottom w:w="20" w:type="dxa"/>
+              <w:start w:w="80" w:type="dxa"/>
+              <w:end w:w="80" w:type="dxa"/>
+            </w:tcMar>
+          </w:tcPr>
+          <w:p>
+            <w:pPr>
+              <w:spacing w:after="40" w:before="40"/>
+            </w:pPr>
+            <w:r>
+              <w:rPr>
+                <w:rFonts w:ascii="Calibri" w:hAnsi="Calibri"/>
+                <w:b w:val="0"/>
+                <w:sz w:val="27"/>
+              </w:rPr>
+              <w:t xml:space="preserve">3. </w:t>
+            </w:r>
+            <w:r>
+              <w:rPr>
+                <w:rFonts w:ascii="Calibri" w:hAnsi="Calibri"/>
+                <w:b w:val="0"/>
+                <w:sz w:val="27"/>
+              </w:rPr>
+              <w:t>____</w:t>
+            </w:r>
+            <w:r>
+              <w:rPr>
+                <w:rFonts w:ascii="Calibri" w:hAnsi="Calibri"/>
+                <w:b/>
+                <w:sz w:val="27"/>
+              </w:rPr>
+              <w:t xml:space="preserve"> Speed</w:t>
+            </w:r>
+          </w:p>
+        </w:tc>
+        <w:tc>
+          <w:tcPr>
+            <w:tcW w:type="dxa" w:w="6048"/>
+            <w:tcMar>
+              <w:top w:w="20" w:type="dxa"/>
+              <w:bottom w:w="20" w:type="dxa"/>
+              <w:start w:w="80" w:type="dxa"/>
+              <w:end w:w="80" w:type="dxa"/>
+            </w:tcMar>
+          </w:tcPr>
+          <w:p>
+            <w:pPr>
+              <w:spacing w:after="40" w:before="40"/>
+            </w:pPr>
+            <w:r>
+              <w:rPr>
+                <w:rFonts w:ascii="Calibri" w:hAnsi="Calibri"/>
+                <w:b/>
+                <w:sz w:val="26"/>
+              </w:rPr>
+              <w:t>C.</w:t>
+            </w:r>
+            <w:r>
+              <w:rPr>
+                <w:rFonts w:ascii="Calibri" w:hAnsi="Calibri"/>
+                <w:b w:val="0"/>
+                <w:sz w:val="26"/>
+              </w:rPr>
+              <w:t xml:space="preserve"> Energy changing from one form to another form.</w:t>
+            </w:r>
+          </w:p>
+        </w:tc>
+      </w:tr>
+      <w:tr>
+        <w:tc>
+          <w:tcPr>
+            <w:tcW w:type="dxa" w:w="3744"/>
+            <w:tcMar>
+              <w:top w:w="20" w:type="dxa"/>
+              <w:bottom w:w="20" w:type="dxa"/>
+              <w:start w:w="80" w:type="dxa"/>
+              <w:end w:w="80" w:type="dxa"/>
+            </w:tcMar>
+          </w:tcPr>
+          <w:p>
+            <w:pPr>
+              <w:spacing w:after="40" w:before="40"/>
+            </w:pPr>
+            <w:r>
+              <w:rPr>
+                <w:rFonts w:ascii="Calibri" w:hAnsi="Calibri"/>
+                <w:b w:val="0"/>
+                <w:sz w:val="27"/>
+              </w:rPr>
+              <w:t xml:space="preserve">4. </w:t>
+            </w:r>
+            <w:r>
+              <w:rPr>
+                <w:rFonts w:ascii="Calibri" w:hAnsi="Calibri"/>
+                <w:b w:val="0"/>
+                <w:sz w:val="27"/>
+              </w:rPr>
+              <w:t>____</w:t>
+            </w:r>
+            <w:r>
+              <w:rPr>
+                <w:rFonts w:ascii="Calibri" w:hAnsi="Calibri"/>
+                <w:b/>
+                <w:sz w:val="27"/>
+              </w:rPr>
+              <w:t xml:space="preserve"> Collision</w:t>
+            </w:r>
+          </w:p>
+        </w:tc>
+        <w:tc>
+          <w:tcPr>
+            <w:tcW w:type="dxa" w:w="6048"/>
+            <w:tcMar>
+              <w:top w:w="20" w:type="dxa"/>
+              <w:bottom w:w="20" w:type="dxa"/>
+              <w:start w:w="80" w:type="dxa"/>
+              <w:end w:w="80" w:type="dxa"/>
+            </w:tcMar>
+          </w:tcPr>
+          <w:p>
+            <w:pPr>
+              <w:spacing w:after="40" w:before="40"/>
+            </w:pPr>
+            <w:r>
+              <w:rPr>
+                <w:rFonts w:ascii="Calibri" w:hAnsi="Calibri"/>
+                <w:b/>
+                <w:sz w:val="26"/>
+              </w:rPr>
+              <w:t>D.</w:t>
+            </w:r>
+            <w:r>
+              <w:rPr>
+                <w:rFonts w:ascii="Calibri" w:hAnsi="Calibri"/>
+                <w:b w:val="0"/>
+                <w:sz w:val="26"/>
+              </w:rPr>
+              <w:t xml:space="preserve"> A form of energy that comes from a vibrating object.</w:t>
+            </w:r>
+          </w:p>
+        </w:tc>
+      </w:tr>
+      <w:tr>
+        <w:tc>
+          <w:tcPr>
+            <w:tcW w:type="dxa" w:w="3744"/>
+            <w:tcMar>
+              <w:top w:w="20" w:type="dxa"/>
+              <w:bottom w:w="20" w:type="dxa"/>
+              <w:start w:w="80" w:type="dxa"/>
+              <w:end w:w="80" w:type="dxa"/>
+            </w:tcMar>
+          </w:tcPr>
+          <w:p>
+            <w:pPr>
+              <w:spacing w:after="40" w:before="40"/>
+            </w:pPr>
+            <w:r>
+              <w:rPr>
+                <w:rFonts w:ascii="Calibri" w:hAnsi="Calibri"/>
+                <w:b w:val="0"/>
+                <w:sz w:val="27"/>
+              </w:rPr>
+              <w:t xml:space="preserve">5. </w:t>
+            </w:r>
+            <w:r>
+              <w:rPr>
+                <w:rFonts w:ascii="Calibri" w:hAnsi="Calibri"/>
+                <w:b w:val="0"/>
+                <w:sz w:val="27"/>
+              </w:rPr>
+              <w:t>____</w:t>
+            </w:r>
+            <w:r>
+              <w:rPr>
+                <w:rFonts w:ascii="Calibri" w:hAnsi="Calibri"/>
+                <w:b/>
+                <w:sz w:val="27"/>
+              </w:rPr>
+              <w:t xml:space="preserve"> Energy of Motion</w:t>
+            </w:r>
+          </w:p>
+        </w:tc>
+        <w:tc>
+          <w:tcPr>
+            <w:tcW w:type="dxa" w:w="6048"/>
+            <w:tcMar>
+              <w:top w:w="20" w:type="dxa"/>
+              <w:bottom w:w="20" w:type="dxa"/>
+              <w:start w:w="80" w:type="dxa"/>
+              <w:end w:w="80" w:type="dxa"/>
+            </w:tcMar>
+          </w:tcPr>
+          <w:p>
+            <w:pPr>
+              <w:spacing w:after="40" w:before="40"/>
+            </w:pPr>
+            <w:r>
+              <w:rPr>
+                <w:rFonts w:ascii="Calibri" w:hAnsi="Calibri"/>
+                <w:b/>
+                <w:sz w:val="26"/>
+              </w:rPr>
+              <w:t>E.</w:t>
+            </w:r>
+            <w:r>
+              <w:rPr>
+                <w:rFonts w:ascii="Calibri" w:hAnsi="Calibri"/>
+                <w:b w:val="0"/>
+                <w:sz w:val="26"/>
+              </w:rPr>
+              <w:t xml:space="preserve"> A measurement of the distance an object travels over an amount of time.</w:t>
+            </w:r>
+          </w:p>
+        </w:tc>
+      </w:tr>
+      <w:tr>
+        <w:tc>
+          <w:tcPr>
+            <w:tcW w:type="dxa" w:w="3744"/>
+            <w:tcMar>
+              <w:top w:w="20" w:type="dxa"/>
+              <w:bottom w:w="20" w:type="dxa"/>
+              <w:start w:w="80" w:type="dxa"/>
+              <w:end w:w="80" w:type="dxa"/>
+            </w:tcMar>
+          </w:tcPr>
+          <w:p>
+            <w:pPr>
+              <w:spacing w:after="40" w:before="40"/>
+            </w:pPr>
+            <w:r>
+              <w:rPr>
+                <w:rFonts w:ascii="Calibri" w:hAnsi="Calibri"/>
+                <w:b w:val="0"/>
+                <w:sz w:val="27"/>
+              </w:rPr>
+              <w:t xml:space="preserve">6. </w:t>
+            </w:r>
+            <w:r>
+              <w:rPr>
+                <w:rFonts w:ascii="Calibri" w:hAnsi="Calibri"/>
+                <w:b w:val="0"/>
+                <w:sz w:val="27"/>
+              </w:rPr>
+              <w:t>____</w:t>
+            </w:r>
+            <w:r>
+              <w:rPr>
+                <w:rFonts w:ascii="Calibri" w:hAnsi="Calibri"/>
+                <w:b/>
+                <w:sz w:val="27"/>
+              </w:rPr>
+              <w:t xml:space="preserve"> Criteria</w:t>
+            </w:r>
+          </w:p>
+        </w:tc>
+        <w:tc>
+          <w:tcPr>
+            <w:tcW w:type="dxa" w:w="6048"/>
+            <w:tcMar>
+              <w:top w:w="20" w:type="dxa"/>
+              <w:bottom w:w="20" w:type="dxa"/>
+              <w:start w:w="80" w:type="dxa"/>
+              <w:end w:w="80" w:type="dxa"/>
+            </w:tcMar>
+          </w:tcPr>
+          <w:p>
+            <w:pPr>
+              <w:spacing w:after="40" w:before="40"/>
+            </w:pPr>
+            <w:r>
+              <w:rPr>
+                <w:rFonts w:ascii="Calibri" w:hAnsi="Calibri"/>
+                <w:b/>
+                <w:sz w:val="26"/>
+              </w:rPr>
+              <w:t>F.</w:t>
+            </w:r>
+            <w:r>
+              <w:rPr>
+                <w:rFonts w:ascii="Calibri" w:hAnsi="Calibri"/>
+                <w:b w:val="0"/>
+                <w:sz w:val="26"/>
+              </w:rPr>
+              <w:t xml:space="preserve"> Energy moving from one place or object to another.</w:t>
+            </w:r>
+          </w:p>
+        </w:tc>
+      </w:tr>
+      <w:tr>
+        <w:tc>
+          <w:tcPr>
+            <w:tcW w:type="dxa" w:w="3744"/>
+            <w:tcMar>
+              <w:top w:w="20" w:type="dxa"/>
+              <w:bottom w:w="20" w:type="dxa"/>
+              <w:start w:w="80" w:type="dxa"/>
+              <w:end w:w="80" w:type="dxa"/>
+            </w:tcMar>
+          </w:tcPr>
+          <w:p>
+            <w:pPr>
+              <w:spacing w:after="40" w:before="40"/>
+            </w:pPr>
+            <w:r>
+              <w:rPr>
+                <w:rFonts w:ascii="Calibri" w:hAnsi="Calibri"/>
+                <w:b w:val="0"/>
+                <w:sz w:val="27"/>
+              </w:rPr>
+              <w:t xml:space="preserve">7. </w:t>
+            </w:r>
+            <w:r>
+              <w:rPr>
+                <w:rFonts w:ascii="Calibri" w:hAnsi="Calibri"/>
+                <w:b w:val="0"/>
+                <w:sz w:val="27"/>
+              </w:rPr>
+              <w:t>____</w:t>
+            </w:r>
+            <w:r>
+              <w:rPr>
+                <w:rFonts w:ascii="Calibri" w:hAnsi="Calibri"/>
+                <w:b/>
+                <w:sz w:val="27"/>
+              </w:rPr>
+              <w:t xml:space="preserve"> Energy Transformation</w:t>
+            </w:r>
+          </w:p>
+        </w:tc>
+        <w:tc>
+          <w:tcPr>
+            <w:tcW w:type="dxa" w:w="6048"/>
+            <w:tcMar>
+              <w:top w:w="20" w:type="dxa"/>
+              <w:bottom w:w="20" w:type="dxa"/>
+              <w:start w:w="80" w:type="dxa"/>
+              <w:end w:w="80" w:type="dxa"/>
+            </w:tcMar>
+          </w:tcPr>
+          <w:p>
+            <w:pPr>
+              <w:spacing w:after="40" w:before="40"/>
+            </w:pPr>
+            <w:r>
+              <w:rPr>
+                <w:rFonts w:ascii="Calibri" w:hAnsi="Calibri"/>
+                <w:b/>
+                <w:sz w:val="26"/>
+              </w:rPr>
+              <w:t>G.</w:t>
+            </w:r>
+            <w:r>
+              <w:rPr>
+                <w:rFonts w:ascii="Calibri" w:hAnsi="Calibri"/>
+                <w:b w:val="0"/>
+                <w:sz w:val="26"/>
+              </w:rPr>
+              <w:t xml:space="preserve"> When two objects come together with impact.</w:t>
+            </w:r>
+          </w:p>
+        </w:tc>
+      </w:tr>
+      <w:tr>
+        <w:tc>
+          <w:tcPr>
+            <w:tcW w:type="dxa" w:w="3744"/>
+            <w:tcMar>
+              <w:top w:w="20" w:type="dxa"/>
+              <w:bottom w:w="20" w:type="dxa"/>
+              <w:start w:w="80" w:type="dxa"/>
+              <w:end w:w="80" w:type="dxa"/>
+            </w:tcMar>
+          </w:tcPr>
+          <w:p>
+            <w:pPr>
+              <w:spacing w:after="40" w:before="40"/>
+            </w:pPr>
+            <w:r>
+              <w:rPr>
+                <w:rFonts w:ascii="Calibri" w:hAnsi="Calibri"/>
+                <w:b w:val="0"/>
+                <w:sz w:val="27"/>
+              </w:rPr>
+              <w:t xml:space="preserve">8. </w:t>
+            </w:r>
+            <w:r>
+              <w:rPr>
+                <w:rFonts w:ascii="Calibri" w:hAnsi="Calibri"/>
+                <w:b w:val="0"/>
+                <w:sz w:val="27"/>
+              </w:rPr>
+              <w:t>____</w:t>
+            </w:r>
+            <w:r>
+              <w:rPr>
+                <w:rFonts w:ascii="Calibri" w:hAnsi="Calibri"/>
+                <w:b/>
+                <w:sz w:val="27"/>
+              </w:rPr>
+              <w:t xml:space="preserve"> Energy</w:t>
+            </w:r>
+          </w:p>
+        </w:tc>
+        <w:tc>
+          <w:tcPr>
+            <w:tcW w:type="dxa" w:w="6048"/>
+            <w:tcMar>
+              <w:top w:w="20" w:type="dxa"/>
+              <w:bottom w:w="20" w:type="dxa"/>
+              <w:start w:w="80" w:type="dxa"/>
+              <w:end w:w="80" w:type="dxa"/>
+            </w:tcMar>
+          </w:tcPr>
+          <w:p>
+            <w:pPr>
+              <w:spacing w:after="40" w:before="40"/>
+            </w:pPr>
+            <w:r>
+              <w:rPr>
+                <w:rFonts w:ascii="Calibri" w:hAnsi="Calibri"/>
+                <w:b/>
+                <w:sz w:val="26"/>
+              </w:rPr>
+              <w:t>H.</w:t>
+            </w:r>
+            <w:r>
+              <w:rPr>
+                <w:rFonts w:ascii="Calibri" w:hAnsi="Calibri"/>
+                <w:b w:val="0"/>
+                <w:sz w:val="26"/>
+              </w:rPr>
+              <w:t xml:space="preserve"> The things a good design must do or have.</w:t>
+            </w:r>
+          </w:p>
+        </w:tc>
+      </w:tr>
+      <w:tr>
+        <w:tc>
+          <w:tcPr>
+            <w:tcW w:type="dxa" w:w="3744"/>
+            <w:tcMar>
+              <w:top w:w="20" w:type="dxa"/>
+              <w:bottom w:w="20" w:type="dxa"/>
+              <w:start w:w="80" w:type="dxa"/>
+              <w:end w:w="80" w:type="dxa"/>
+            </w:tcMar>
+          </w:tcPr>
+          <w:p>
+            <w:pPr>
+              <w:spacing w:after="40" w:before="40"/>
+            </w:pPr>
+            <w:r>
+              <w:rPr>
+                <w:rFonts w:ascii="Calibri" w:hAnsi="Calibri"/>
+                <w:b w:val="0"/>
+                <w:sz w:val="27"/>
+              </w:rPr>
+            </w:r>
+          </w:p>
+        </w:tc>
+        <w:tc>
+          <w:tcPr>
+            <w:tcW w:type="dxa" w:w="6048"/>
+            <w:tcMar>
+              <w:top w:w="20" w:type="dxa"/>
+              <w:bottom w:w="20" w:type="dxa"/>
+              <w:start w:w="80" w:type="dxa"/>
+              <w:end w:w="80" w:type="dxa"/>
+            </w:tcMar>
+          </w:tcPr>
+          <w:p>
+            <w:pPr>
+              <w:spacing w:after="40" w:before="40"/>
+            </w:pPr>
+            <w:r>
+              <w:rPr>
+                <w:rFonts w:ascii="Calibri" w:hAnsi="Calibri"/>
+                <w:b/>
+                <w:sz w:val="26"/>
+              </w:rPr>
+              <w:t>I.</w:t>
+            </w:r>
+            <w:r>
+              <w:rPr>
+                <w:rFonts w:ascii="Calibri" w:hAnsi="Calibri"/>
+                <w:b w:val="0"/>
+                <w:sz w:val="26"/>
+              </w:rPr>
+              <w:t xml:space="preserve"> Energy that can cause a change at a later time.</w:t>
+            </w:r>
+          </w:p>
+        </w:tc>
+      </w:tr>
+      <w:tr>
+        <w:tc>
+          <w:tcPr>
+            <w:tcW w:type="dxa" w:w="3744"/>
+            <w:tcMar>
+              <w:top w:w="20" w:type="dxa"/>
+              <w:bottom w:w="20" w:type="dxa"/>
+              <w:start w:w="80" w:type="dxa"/>
+              <w:end w:w="80" w:type="dxa"/>
+            </w:tcMar>
+          </w:tcPr>
+          <w:p>
+            <w:pPr>
+              <w:spacing w:after="40" w:before="40"/>
+            </w:pPr>
+            <w:r>
+              <w:rPr>
+                <w:rFonts w:ascii="Calibri" w:hAnsi="Calibri"/>
+                <w:b w:val="0"/>
+                <w:sz w:val="27"/>
+              </w:rPr>
+            </w:r>
+          </w:p>
+        </w:tc>
+        <w:tc>
+          <w:tcPr>
+            <w:tcW w:type="dxa" w:w="6048"/>
+            <w:tcMar>
+              <w:top w:w="20" w:type="dxa"/>
+              <w:bottom w:w="20" w:type="dxa"/>
+              <w:start w:w="80" w:type="dxa"/>
+              <w:end w:w="80" w:type="dxa"/>
+            </w:tcMar>
+          </w:tcPr>
+          <w:p>
+            <w:pPr>
+              <w:spacing w:after="40" w:before="40"/>
+            </w:pPr>
+            <w:r>
+              <w:rPr>
+                <w:rFonts w:ascii="Calibri" w:hAnsi="Calibri"/>
+                <w:b/>
+                <w:sz w:val="26"/>
+              </w:rPr>
+              <w:t>J.</w:t>
+            </w:r>
+            <w:r>
+              <w:rPr>
+                <w:rFonts w:ascii="Calibri" w:hAnsi="Calibri"/>
+                <w:b w:val="0"/>
+                <w:sz w:val="26"/>
+              </w:rPr>
+              <w:t xml:space="preserve"> The energy an object has while it is moving.</w:t>
+            </w:r>
+          </w:p>
+        </w:tc>
+      </w:tr>
+      <w:tr>
+        <w:tc>
+          <w:tcPr>
+            <w:tcW w:type="dxa" w:w="3744"/>
+            <w:tcMar>
+              <w:top w:w="20" w:type="dxa"/>
+              <w:bottom w:w="20" w:type="dxa"/>
+              <w:start w:w="80" w:type="dxa"/>
+              <w:end w:w="80" w:type="dxa"/>
+            </w:tcMar>
+          </w:tcPr>
+          <w:p>
+            <w:pPr>
+              <w:spacing w:after="40" w:before="40"/>
+            </w:pPr>
+            <w:r>
+              <w:rPr>
+                <w:rFonts w:ascii="Calibri" w:hAnsi="Calibri"/>
+                <w:b w:val="0"/>
+                <w:sz w:val="27"/>
+              </w:rPr>
+            </w:r>
+          </w:p>
+        </w:tc>
+        <w:tc>
+          <w:tcPr>
+            <w:tcW w:type="dxa" w:w="6048"/>
+            <w:tcMar>
+              <w:top w:w="20" w:type="dxa"/>
+              <w:bottom w:w="20" w:type="dxa"/>
+              <w:start w:w="80" w:type="dxa"/>
+              <w:end w:w="80" w:type="dxa"/>
+            </w:tcMar>
+          </w:tcPr>
+          <w:p>
+            <w:pPr>
+              <w:spacing w:after="40" w:before="40"/>
+            </w:pPr>
+            <w:r>
+              <w:rPr>
+                <w:rFonts w:ascii="Calibri" w:hAnsi="Calibri"/>
+                <w:b/>
+                <w:sz w:val="26"/>
+              </w:rPr>
+              <w:t>K.</w:t>
+            </w:r>
+            <w:r>
+              <w:rPr>
+                <w:rFonts w:ascii="Calibri" w:hAnsi="Calibri"/>
+                <w:b w:val="0"/>
+                <w:sz w:val="26"/>
+              </w:rPr>
+              <w:t xml:space="preserve"> The process of an object changing position.</w:t>
             </w:r>
           </w:p>
         </w:tc>
@@ -300,716 +909,161 @@
     </w:tbl>
     <w:p>
       <w:pPr>
-        <w:spacing w:before="0" w:after="40"/>
+        <w:spacing w:after="40" w:before="0"/>
       </w:pPr>
       <w:r>
         <w:rPr>
           <w:rFonts w:ascii="Calibri" w:hAnsi="Calibri"/>
           <w:b w:val="0"/>
-          <w:i w:val="0"/>
-          <w:color w:val="1A1A1A"/>
           <w:sz w:val="24"/>
         </w:rPr>
-        <w:t>Type of energy: ____________________________</w:t>
       </w:r>
     </w:p>
     <w:p>
       <w:pPr>
-        <w:spacing w:before="0" w:after="40"/>
+        <w:spacing w:after="80" w:before="0"/>
+      </w:pPr>
+      <w:r>
+        <w:rPr>
+          <w:rFonts w:ascii="Calibri" w:hAnsi="Calibri"/>
+          <w:b/>
+          <w:sz w:val="32"/>
+        </w:rPr>
+        <w:t>Part 2: Multiple Choice (Questions 9–25)</w:t>
+      </w:r>
+    </w:p>
+    <w:p>
+      <w:pPr>
+        <w:spacing w:after="120" w:before="0"/>
       </w:pPr>
       <w:r>
         <w:rPr>
           <w:rFonts w:ascii="Calibri" w:hAnsi="Calibri"/>
           <w:b w:val="0"/>
-          <w:i w:val="0"/>
-          <w:color w:val="1A1A1A"/>
-          <w:sz w:val="24"/>
+          <w:sz w:val="26"/>
         </w:rPr>
-        <w:t>Describe the change: ____________________________</w:t>
+        <w:t>Choose the ONE BEST ANSWER for each question.</w:t>
       </w:r>
     </w:p>
     <w:p>
       <w:pPr>
-        <w:spacing w:before="0" w:after="160"/>
-      </w:pPr>
-      <w:r>
-        <w:rPr>
-          <w:rFonts w:ascii="Calibri" w:hAnsi="Calibri"/>
-          <w:b w:val="0"/>
-          <w:i w:val="0"/>
-          <w:color w:val="1A1A1A"/>
-          <w:sz w:val="24"/>
-        </w:rPr>
-        <w:t xml:space="preserve">                                                            </w:t>
-      </w:r>
-    </w:p>
-    <w:p>
-      <w:pPr>
-        <w:spacing w:before="120" w:after="40"/>
+        <w:keepNext/>
+        <w:spacing w:after="60" w:before="80"/>
       </w:pPr>
       <w:r>
         <w:rPr>
           <w:rFonts w:ascii="Calibri" w:hAnsi="Calibri"/>
           <w:b/>
-          <w:i w:val="0"/>
-          <w:color w:val="1A1A1A"/>
-          <w:sz w:val="24"/>
+          <w:sz w:val="27"/>
         </w:rPr>
-        <w:t>4. Explain how an observable change is EVIDENCE that energy is involved.</w:t>
+        <w:t xml:space="preserve">9. </w:t>
+      </w:r>
+      <w:r>
+        <w:rPr>
+          <w:rFonts w:ascii="Calibri" w:hAnsi="Calibri"/>
+          <w:b w:val="0"/>
+          <w:sz w:val="27"/>
+        </w:rPr>
+        <w:t>What does energy allow an object or a system to do?</w:t>
       </w:r>
     </w:p>
     <w:p>
       <w:pPr>
-        <w:spacing w:before="0" w:after="160"/>
-      </w:pPr>
-      <w:r>
-        <w:rPr>
-          <w:rFonts w:ascii="Calibri" w:hAnsi="Calibri"/>
-          <w:b w:val="0"/>
-          <w:i w:val="0"/>
-          <w:color w:val="1A1A1A"/>
-          <w:sz w:val="24"/>
-        </w:rPr>
-        <w:t xml:space="preserve">                                                            </w:t>
-      </w:r>
-    </w:p>
-    <w:p>
-      <w:pPr>
-        <w:spacing w:before="0" w:after="160"/>
-      </w:pPr>
-      <w:r>
-        <w:rPr>
-          <w:rFonts w:ascii="Calibri" w:hAnsi="Calibri"/>
-          <w:b w:val="0"/>
-          <w:i w:val="0"/>
-          <w:color w:val="1A1A1A"/>
-          <w:sz w:val="24"/>
-        </w:rPr>
-        <w:t xml:space="preserve">                                                            </w:t>
-      </w:r>
-    </w:p>
-    <w:p>
-      <w:pPr>
-        <w:spacing w:before="160" w:after="40"/>
+        <w:keepNext/>
+        <w:spacing w:after="40" w:before="0"/>
       </w:pPr>
       <w:r>
         <w:rPr>
           <w:rFonts w:ascii="Calibri" w:hAnsi="Calibri"/>
           <w:b/>
-          <w:i w:val="0"/>
-          <w:color w:val="1F3A5F"/>
           <w:sz w:val="26"/>
         </w:rPr>
-        <w:t>Section 2 — Moving Objects Have Energy</w:t>
+        <w:t xml:space="preserve">A. </w:t>
+      </w:r>
+      <w:r>
+        <w:rPr>
+          <w:rFonts w:ascii="Calibri" w:hAnsi="Calibri"/>
+          <w:b w:val="0"/>
+          <w:sz w:val="26"/>
+        </w:rPr>
+        <w:t>Stay exactly the same forever</w:t>
       </w:r>
     </w:p>
     <w:p>
       <w:pPr>
-        <w:spacing w:before="120" w:after="40"/>
+        <w:keepNext/>
+        <w:spacing w:after="40" w:before="0"/>
       </w:pPr>
       <w:r>
         <w:rPr>
           <w:rFonts w:ascii="Calibri" w:hAnsi="Calibri"/>
           <w:b/>
-          <w:i w:val="0"/>
-          <w:color w:val="1A1A1A"/>
-          <w:sz w:val="24"/>
+          <w:sz w:val="26"/>
         </w:rPr>
-        <w:t>5. A moving object has ______.</w:t>
+        <w:t xml:space="preserve">B. </w:t>
+      </w:r>
+      <w:r>
+        <w:rPr>
+          <w:rFonts w:ascii="Calibri" w:hAnsi="Calibri"/>
+          <w:b w:val="0"/>
+          <w:sz w:val="26"/>
+        </w:rPr>
+        <w:t>Disappear without leaving a trace</w:t>
       </w:r>
     </w:p>
     <w:p>
       <w:pPr>
-        <w:spacing w:before="0" w:after="20"/>
-      </w:pPr>
-      <w:r>
-        <w:rPr>
-          <w:rFonts w:ascii="Calibri" w:hAnsi="Calibri"/>
-          <w:b w:val="0"/>
-          <w:i w:val="0"/>
-          <w:color w:val="1A1A1A"/>
-          <w:sz w:val="24"/>
-        </w:rPr>
-        <w:t xml:space="preserve">    a) stored energy only</w:t>
-      </w:r>
-    </w:p>
-    <w:p>
-      <w:pPr>
-        <w:spacing w:before="0" w:after="20"/>
-      </w:pPr>
-      <w:r>
-        <w:rPr>
-          <w:rFonts w:ascii="Calibri" w:hAnsi="Calibri"/>
-          <w:b w:val="0"/>
-          <w:i w:val="0"/>
-          <w:color w:val="1A1A1A"/>
-          <w:sz w:val="24"/>
-        </w:rPr>
-        <w:t xml:space="preserve">    b) no energy</w:t>
-      </w:r>
-    </w:p>
-    <w:p>
-      <w:pPr>
-        <w:spacing w:before="0" w:after="20"/>
-      </w:pPr>
-      <w:r>
-        <w:rPr>
-          <w:rFonts w:ascii="Calibri" w:hAnsi="Calibri"/>
-          <w:b w:val="0"/>
-          <w:i w:val="0"/>
-          <w:color w:val="1A1A1A"/>
-          <w:sz w:val="24"/>
-        </w:rPr>
-        <w:t xml:space="preserve">    c) energy of motion</w:t>
-      </w:r>
-    </w:p>
-    <w:p>
-      <w:pPr>
-        <w:spacing w:before="0" w:after="20"/>
-      </w:pPr>
-      <w:r>
-        <w:rPr>
-          <w:rFonts w:ascii="Calibri" w:hAnsi="Calibri"/>
-          <w:b w:val="0"/>
-          <w:i w:val="0"/>
-          <w:color w:val="1A1A1A"/>
-          <w:sz w:val="24"/>
-        </w:rPr>
-        <w:t xml:space="preserve">    d) only sound energy</w:t>
-      </w:r>
-    </w:p>
-    <w:p>
-      <w:pPr>
-        <w:spacing w:before="120" w:after="40"/>
+        <w:keepNext/>
+        <w:spacing w:after="40" w:before="0"/>
       </w:pPr>
       <w:r>
         <w:rPr>
           <w:rFonts w:ascii="Calibri" w:hAnsi="Calibri"/>
           <w:b/>
-          <w:i w:val="0"/>
-          <w:color w:val="1A1A1A"/>
-          <w:sz w:val="24"/>
+          <w:sz w:val="26"/>
         </w:rPr>
-        <w:t>6. Which shows a moving object causing a change?</w:t>
+        <w:t xml:space="preserve">C. </w:t>
+      </w:r>
+      <w:r>
+        <w:rPr>
+          <w:rFonts w:ascii="Calibri" w:hAnsi="Calibri"/>
+          <w:b w:val="0"/>
+          <w:sz w:val="26"/>
+        </w:rPr>
+        <w:t>Cause a change</w:t>
       </w:r>
     </w:p>
     <w:p>
       <w:pPr>
-        <w:spacing w:before="0" w:after="20"/>
-      </w:pPr>
-      <w:r>
-        <w:rPr>
-          <w:rFonts w:ascii="Calibri" w:hAnsi="Calibri"/>
-          <w:b w:val="0"/>
-          <w:i w:val="0"/>
-          <w:color w:val="1A1A1A"/>
-          <w:sz w:val="24"/>
-        </w:rPr>
-        <w:t xml:space="preserve">    a) A ball sitting on a shelf</w:t>
-      </w:r>
-    </w:p>
-    <w:p>
-      <w:pPr>
-        <w:spacing w:before="0" w:after="20"/>
-      </w:pPr>
-      <w:r>
-        <w:rPr>
-          <w:rFonts w:ascii="Calibri" w:hAnsi="Calibri"/>
-          <w:b w:val="0"/>
-          <w:i w:val="0"/>
-          <w:color w:val="1A1A1A"/>
-          <w:sz w:val="24"/>
-        </w:rPr>
-        <w:t xml:space="preserve">    b) A rolling ball knocks over a block</w:t>
-      </w:r>
-    </w:p>
-    <w:p>
-      <w:pPr>
-        <w:spacing w:before="0" w:after="20"/>
-      </w:pPr>
-      <w:r>
-        <w:rPr>
-          <w:rFonts w:ascii="Calibri" w:hAnsi="Calibri"/>
-          <w:b w:val="0"/>
-          <w:i w:val="0"/>
-          <w:color w:val="1A1A1A"/>
-          <w:sz w:val="24"/>
-        </w:rPr>
-        <w:t xml:space="preserve">    c) A pencil lying on a desk</w:t>
-      </w:r>
-    </w:p>
-    <w:p>
-      <w:pPr>
-        <w:spacing w:before="0" w:after="20"/>
-      </w:pPr>
-      <w:r>
-        <w:rPr>
-          <w:rFonts w:ascii="Calibri" w:hAnsi="Calibri"/>
-          <w:b w:val="0"/>
-          <w:i w:val="0"/>
-          <w:color w:val="1A1A1A"/>
-          <w:sz w:val="24"/>
-        </w:rPr>
-        <w:t xml:space="preserve">    d) A book held still in your hand</w:t>
-      </w:r>
-    </w:p>
-    <w:p>
-      <w:pPr>
-        <w:spacing w:before="120" w:after="40"/>
+        <w:spacing w:after="40" w:before="0"/>
       </w:pPr>
       <w:r>
         <w:rPr>
           <w:rFonts w:ascii="Calibri" w:hAnsi="Calibri"/>
           <w:b/>
-          <w:i w:val="0"/>
-          <w:color w:val="1A1A1A"/>
-          <w:sz w:val="24"/>
+          <w:sz w:val="26"/>
         </w:rPr>
-        <w:t>7. Give ONE example of a moving object causing a change. Describe the change.</w:t>
+        <w:t xml:space="preserve">D. </w:t>
+      </w:r>
+      <w:r>
+        <w:rPr>
+          <w:rFonts w:ascii="Calibri" w:hAnsi="Calibri"/>
+          <w:b w:val="0"/>
+          <w:sz w:val="26"/>
+        </w:rPr>
+        <w:t>Become invisible</w:t>
       </w:r>
     </w:p>
     <w:p>
       <w:pPr>
-        <w:spacing w:before="0" w:after="160"/>
-      </w:pPr>
-      <w:r>
-        <w:rPr>
-          <w:rFonts w:ascii="Calibri" w:hAnsi="Calibri"/>
-          <w:b w:val="0"/>
-          <w:i w:val="0"/>
-          <w:color w:val="1A1A1A"/>
-          <w:sz w:val="24"/>
-        </w:rPr>
-        <w:t xml:space="preserve">                                                            </w:t>
-      </w:r>
-    </w:p>
-    <w:p>
-      <w:pPr>
-        <w:spacing w:before="0" w:after="160"/>
-      </w:pPr>
-      <w:r>
-        <w:rPr>
-          <w:rFonts w:ascii="Calibri" w:hAnsi="Calibri"/>
-          <w:b w:val="0"/>
-          <w:i w:val="0"/>
-          <w:color w:val="1A1A1A"/>
-          <w:sz w:val="24"/>
-        </w:rPr>
-        <w:t xml:space="preserve">                                                            </w:t>
-      </w:r>
-    </w:p>
-    <w:p>
-      <w:pPr>
-        <w:spacing w:before="160" w:after="40"/>
-      </w:pPr>
-      <w:r>
-        <w:rPr>
-          <w:rFonts w:ascii="Calibri" w:hAnsi="Calibri"/>
-          <w:b/>
-          <w:i w:val="0"/>
-          <w:color w:val="1F3A5F"/>
-          <w:sz w:val="26"/>
-        </w:rPr>
-        <w:t>Section 3 — Speed and Energy (Same Object)</w:t>
-      </w:r>
-    </w:p>
-    <w:p>
-      <w:pPr>
-        <w:spacing w:before="120" w:after="40"/>
-      </w:pPr>
-      <w:r>
-        <w:rPr>
-          <w:rFonts w:ascii="Calibri" w:hAnsi="Calibri"/>
-          <w:b/>
-          <w:i w:val="0"/>
-          <w:color w:val="1A1A1A"/>
-          <w:sz w:val="24"/>
-        </w:rPr>
-        <w:t>8. Read the table. The SAME toy car rolled down a ramp at three heights and pushed a cup.</w:t>
-      </w:r>
-    </w:p>
-    <w:tbl>
-      <w:tblPr>
-        <w:tblW w:type="auto" w:w="0"/>
-        <w:jc w:val="center"/>
-        <w:tblLook w:firstColumn="1" w:firstRow="1" w:lastColumn="0" w:lastRow="0" w:noHBand="0" w:noVBand="1" w:val="04A0"/>
-      </w:tblPr>
-      <w:tblGrid>
-        <w:gridCol w:w="3504"/>
-        <w:gridCol w:w="3504"/>
-        <w:gridCol w:w="3504"/>
-      </w:tblGrid>
-      <w:tr>
-        <w:tc>
-          <w:tcPr>
-            <w:tcW w:type="dxa" w:w="3504"/>
-            <w:shd w:val="clear" w:color="auto" w:fill="1F3A5F"/>
-          </w:tcPr>
-          <w:p>
-            <w:r/>
-            <w:r>
-              <w:rPr>
-                <w:rFonts w:ascii="Calibri" w:hAnsi="Calibri"/>
-                <w:b/>
-                <w:i w:val="0"/>
-                <w:color w:val="FFFFFF"/>
-                <w:sz w:val="24"/>
-              </w:rPr>
-              <w:t>Ramp height</w:t>
-            </w:r>
-          </w:p>
-        </w:tc>
-        <w:tc>
-          <w:tcPr>
-            <w:tcW w:type="dxa" w:w="3504"/>
-            <w:shd w:val="clear" w:color="auto" w:fill="1F3A5F"/>
-          </w:tcPr>
-          <w:p>
-            <w:r/>
-            <w:r>
-              <w:rPr>
-                <w:rFonts w:ascii="Calibri" w:hAnsi="Calibri"/>
-                <w:b/>
-                <w:i w:val="0"/>
-                <w:color w:val="FFFFFF"/>
-                <w:sz w:val="24"/>
-              </w:rPr>
-              <w:t>Cup movement (measured)</w:t>
-            </w:r>
-          </w:p>
-        </w:tc>
-        <w:tc>
-          <w:tcPr>
-            <w:tcW w:type="dxa" w:w="3504"/>
-            <w:shd w:val="clear" w:color="auto" w:fill="1F3A5F"/>
-          </w:tcPr>
-          <w:p>
-            <w:r/>
-            <w:r>
-              <w:rPr>
-                <w:rFonts w:ascii="Calibri" w:hAnsi="Calibri"/>
-                <w:b/>
-                <w:i w:val="0"/>
-                <w:color w:val="FFFFFF"/>
-                <w:sz w:val="24"/>
-              </w:rPr>
-              <w:t>Energy of motion (inferred)</w:t>
-            </w:r>
-          </w:p>
-        </w:tc>
-      </w:tr>
-      <w:tr>
-        <w:tc>
-          <w:tcPr>
-            <w:tcW w:type="dxa" w:w="3504"/>
-          </w:tcPr>
-          <w:p>
-            <w:r/>
-            <w:r>
-              <w:rPr>
-                <w:rFonts w:ascii="Calibri" w:hAnsi="Calibri"/>
-                <w:b w:val="0"/>
-                <w:i w:val="0"/>
-                <w:color w:val="1A1A1A"/>
-                <w:sz w:val="24"/>
-              </w:rPr>
-              <w:t>Low</w:t>
-            </w:r>
-          </w:p>
-        </w:tc>
-        <w:tc>
-          <w:tcPr>
-            <w:tcW w:type="dxa" w:w="3504"/>
-          </w:tcPr>
-          <w:p>
-            <w:r/>
-            <w:r>
-              <w:rPr>
-                <w:rFonts w:ascii="Calibri" w:hAnsi="Calibri"/>
-                <w:b w:val="0"/>
-                <w:i w:val="0"/>
-                <w:color w:val="1A1A1A"/>
-                <w:sz w:val="24"/>
-              </w:rPr>
-              <w:t>moved a little</w:t>
-            </w:r>
-          </w:p>
-        </w:tc>
-        <w:tc>
-          <w:tcPr>
-            <w:tcW w:type="dxa" w:w="3504"/>
-          </w:tcPr>
-          <w:p>
-            <w:r/>
-            <w:r>
-              <w:rPr>
-                <w:rFonts w:ascii="Calibri" w:hAnsi="Calibri"/>
-                <w:b w:val="0"/>
-                <w:i w:val="0"/>
-                <w:color w:val="1A1A1A"/>
-                <w:sz w:val="24"/>
-              </w:rPr>
-              <w:t>less</w:t>
-            </w:r>
-          </w:p>
-        </w:tc>
-      </w:tr>
-      <w:tr>
-        <w:tc>
-          <w:tcPr>
-            <w:tcW w:type="dxa" w:w="3504"/>
-          </w:tcPr>
-          <w:p>
-            <w:r/>
-            <w:r>
-              <w:rPr>
-                <w:rFonts w:ascii="Calibri" w:hAnsi="Calibri"/>
-                <w:b w:val="0"/>
-                <w:i w:val="0"/>
-                <w:color w:val="1A1A1A"/>
-                <w:sz w:val="24"/>
-              </w:rPr>
-              <w:t>Medium</w:t>
-            </w:r>
-          </w:p>
-        </w:tc>
-        <w:tc>
-          <w:tcPr>
-            <w:tcW w:type="dxa" w:w="3504"/>
-          </w:tcPr>
-          <w:p>
-            <w:r/>
-            <w:r>
-              <w:rPr>
-                <w:rFonts w:ascii="Calibri" w:hAnsi="Calibri"/>
-                <w:b w:val="0"/>
-                <w:i w:val="0"/>
-                <w:color w:val="1A1A1A"/>
-                <w:sz w:val="24"/>
-              </w:rPr>
-              <w:t>moved more</w:t>
-            </w:r>
-          </w:p>
-        </w:tc>
-        <w:tc>
-          <w:tcPr>
-            <w:tcW w:type="dxa" w:w="3504"/>
-          </w:tcPr>
-          <w:p>
-            <w:r/>
-            <w:r>
-              <w:rPr>
-                <w:rFonts w:ascii="Calibri" w:hAnsi="Calibri"/>
-                <w:b w:val="0"/>
-                <w:i w:val="0"/>
-                <w:color w:val="1A1A1A"/>
-                <w:sz w:val="24"/>
-              </w:rPr>
-              <w:t>more</w:t>
-            </w:r>
-          </w:p>
-        </w:tc>
-      </w:tr>
-      <w:tr>
-        <w:tc>
-          <w:tcPr>
-            <w:tcW w:type="dxa" w:w="3504"/>
-          </w:tcPr>
-          <w:p>
-            <w:r/>
-            <w:r>
-              <w:rPr>
-                <w:rFonts w:ascii="Calibri" w:hAnsi="Calibri"/>
-                <w:b w:val="0"/>
-                <w:i w:val="0"/>
-                <w:color w:val="1A1A1A"/>
-                <w:sz w:val="24"/>
-              </w:rPr>
-              <w:t>High</w:t>
-            </w:r>
-          </w:p>
-        </w:tc>
-        <w:tc>
-          <w:tcPr>
-            <w:tcW w:type="dxa" w:w="3504"/>
-          </w:tcPr>
-          <w:p>
-            <w:r/>
-            <w:r>
-              <w:rPr>
-                <w:rFonts w:ascii="Calibri" w:hAnsi="Calibri"/>
-                <w:b w:val="0"/>
-                <w:i w:val="0"/>
-                <w:color w:val="1A1A1A"/>
-                <w:sz w:val="24"/>
-              </w:rPr>
-              <w:t>moved the most</w:t>
-            </w:r>
-          </w:p>
-        </w:tc>
-        <w:tc>
-          <w:tcPr>
-            <w:tcW w:type="dxa" w:w="3504"/>
-          </w:tcPr>
-          <w:p>
-            <w:r/>
-            <w:r>
-              <w:rPr>
-                <w:rFonts w:ascii="Calibri" w:hAnsi="Calibri"/>
-                <w:b w:val="0"/>
-                <w:i w:val="0"/>
-                <w:color w:val="1A1A1A"/>
-                <w:sz w:val="24"/>
-              </w:rPr>
-              <w:t>most</w:t>
-            </w:r>
-          </w:p>
-        </w:tc>
-      </w:tr>
-    </w:tbl>
-    <w:p>
-      <w:pPr>
-        <w:spacing w:before="0" w:after="40"/>
-      </w:pPr>
-      <w:r>
-        <w:rPr>
-          <w:rFonts w:ascii="Calibri" w:hAnsi="Calibri"/>
-          <w:b w:val="0"/>
-          <w:i w:val="0"/>
-          <w:color w:val="1A1A1A"/>
-          <w:sz w:val="24"/>
-        </w:rPr>
-        <w:t>What pattern do you see?</w:t>
-      </w:r>
-    </w:p>
-    <w:p>
-      <w:pPr>
-        <w:spacing w:before="0" w:after="160"/>
-      </w:pPr>
-      <w:r>
-        <w:rPr>
-          <w:rFonts w:ascii="Calibri" w:hAnsi="Calibri"/>
-          <w:b w:val="0"/>
-          <w:i w:val="0"/>
-          <w:color w:val="1A1A1A"/>
-          <w:sz w:val="24"/>
-        </w:rPr>
-        <w:t xml:space="preserve">                                                            </w:t>
-      </w:r>
-    </w:p>
-    <w:p>
-      <w:pPr>
-        <w:spacing w:before="0" w:after="160"/>
-      </w:pPr>
-      <w:r>
-        <w:rPr>
-          <w:rFonts w:ascii="Calibri" w:hAnsi="Calibri"/>
-          <w:b w:val="0"/>
-          <w:i w:val="0"/>
-          <w:color w:val="1A1A1A"/>
-          <w:sz w:val="24"/>
-        </w:rPr>
-        <w:t xml:space="preserve">                                                            </w:t>
-      </w:r>
-    </w:p>
-    <w:p>
-      <w:pPr>
-        <w:spacing w:before="120" w:after="40"/>
-      </w:pPr>
-      <w:r>
-        <w:rPr>
-          <w:rFonts w:ascii="Calibri" w:hAnsi="Calibri"/>
-          <w:b/>
-          <w:i w:val="0"/>
-          <w:color w:val="1A1A1A"/>
-          <w:sz w:val="24"/>
-        </w:rPr>
-        <w:t>9. In the ramp test, what do we MEASURE, and what do we INFER?</w:t>
-      </w:r>
-    </w:p>
-    <w:p>
-      <w:pPr>
-        <w:spacing w:before="0" w:after="20"/>
-      </w:pPr>
-      <w:r>
-        <w:rPr>
-          <w:rFonts w:ascii="Calibri" w:hAnsi="Calibri"/>
-          <w:b w:val="0"/>
-          <w:i w:val="0"/>
-          <w:color w:val="1A1A1A"/>
-          <w:sz w:val="24"/>
-        </w:rPr>
-        <w:t xml:space="preserve">    a) measure cup movement, infer speed</w:t>
-      </w:r>
-    </w:p>
-    <w:p>
-      <w:pPr>
-        <w:spacing w:before="0" w:after="20"/>
-      </w:pPr>
-      <w:r>
-        <w:rPr>
-          <w:rFonts w:ascii="Calibri" w:hAnsi="Calibri"/>
-          <w:b w:val="0"/>
-          <w:i w:val="0"/>
-          <w:color w:val="1A1A1A"/>
-          <w:sz w:val="24"/>
-        </w:rPr>
-        <w:t xml:space="preserve">    b) measure speed, infer cup movement</w:t>
-      </w:r>
-    </w:p>
-    <w:p>
-      <w:pPr>
-        <w:spacing w:before="0" w:after="20"/>
-      </w:pPr>
-      <w:r>
-        <w:rPr>
-          <w:rFonts w:ascii="Calibri" w:hAnsi="Calibri"/>
-          <w:b w:val="0"/>
-          <w:i w:val="0"/>
-          <w:color w:val="1A1A1A"/>
-          <w:sz w:val="24"/>
-        </w:rPr>
-        <w:t xml:space="preserve">    c) measure energy, infer height</w:t>
-      </w:r>
-    </w:p>
-    <w:p>
-      <w:pPr>
-        <w:spacing w:before="0" w:after="20"/>
-      </w:pPr>
-      <w:r>
-        <w:rPr>
-          <w:rFonts w:ascii="Calibri" w:hAnsi="Calibri"/>
-          <w:b w:val="0"/>
-          <w:i w:val="0"/>
-          <w:color w:val="1A1A1A"/>
-          <w:sz w:val="24"/>
-        </w:rPr>
-        <w:t xml:space="preserve">    d) measure height, infer the car's color</w:t>
-      </w:r>
-    </w:p>
-    <w:p>
-      <w:pPr>
-        <w:spacing w:before="120" w:after="40"/>
-      </w:pPr>
-      <w:r>
-        <w:rPr>
-          <w:rFonts w:ascii="Calibri" w:hAnsi="Calibri"/>
-          <w:b/>
-          <w:i w:val="0"/>
-          <w:color w:val="1A1A1A"/>
-          <w:sz w:val="24"/>
-        </w:rPr>
-        <w:t>10. Look at the graph. It shows how far the cup moved at different ramp heights for the SAME car.</w:t>
-      </w:r>
-    </w:p>
-    <w:p>
-      <w:pPr>
+        <w:keepNext/>
+        <w:spacing w:after="80"/>
         <w:jc w:val="center"/>
       </w:pPr>
       <w:r>
         <w:drawing>
           <wp:inline xmlns:a="http://schemas.openxmlformats.org/drawingml/2006/main" xmlns:pic="http://schemas.openxmlformats.org/drawingml/2006/picture">
-            <wp:extent cx="4206240" cy="2103120"/>
+            <wp:extent cx="5486400" cy="1371600"/>
             <wp:docPr id="1" name="Picture 1"/>
             <wp:cNvGraphicFramePr>
               <a:graphicFrameLocks noChangeAspect="1"/>
@@ -1018,7 +1072,7 @@
               <a:graphicData uri="http://schemas.openxmlformats.org/drawingml/2006/picture">
                 <pic:pic>
                   <pic:nvPicPr>
-                    <pic:cNvPr id="0" name="ch7_ramp_graph.png"/>
+                    <pic:cNvPr id="0" name="ramp.png"/>
                     <pic:cNvPicPr/>
                   </pic:nvPicPr>
                   <pic:blipFill>
@@ -1030,7 +1084,7 @@
                   <pic:spPr>
                     <a:xfrm>
                       <a:off x="0" y="0"/>
-                      <a:ext cx="4206240" cy="2103120"/>
+                      <a:ext cx="5486400" cy="1371600"/>
                     </a:xfrm>
                     <a:prstGeom prst="rect"/>
                   </pic:spPr>
@@ -1043,1390 +1097,1915 @@
     </w:p>
     <w:p>
       <w:pPr>
-        <w:spacing w:before="0" w:after="40"/>
-      </w:pPr>
-      <w:r>
-        <w:rPr>
-          <w:rFonts w:ascii="Calibri" w:hAnsi="Calibri"/>
-          <w:b w:val="0"/>
-          <w:i w:val="0"/>
-          <w:color w:val="1A1A1A"/>
-          <w:sz w:val="24"/>
-        </w:rPr>
-        <w:t>As ramp height increases, cup movement ______. This is evidence that a faster car has ______ energy of motion.</w:t>
-      </w:r>
-    </w:p>
-    <w:p>
-      <w:pPr>
-        <w:spacing w:before="0" w:after="160"/>
-      </w:pPr>
-      <w:r>
-        <w:rPr>
-          <w:rFonts w:ascii="Calibri" w:hAnsi="Calibri"/>
-          <w:b w:val="0"/>
-          <w:i w:val="0"/>
-          <w:color w:val="1A1A1A"/>
-          <w:sz w:val="24"/>
-        </w:rPr>
-        <w:t xml:space="preserve">                                                            </w:t>
-      </w:r>
-    </w:p>
-    <w:p>
-      <w:pPr>
-        <w:spacing w:before="0" w:after="160"/>
-      </w:pPr>
-      <w:r>
-        <w:rPr>
-          <w:rFonts w:ascii="Calibri" w:hAnsi="Calibri"/>
-          <w:b w:val="0"/>
-          <w:i w:val="0"/>
-          <w:color w:val="1A1A1A"/>
-          <w:sz w:val="24"/>
-        </w:rPr>
-        <w:t xml:space="preserve">                                                            </w:t>
-      </w:r>
-    </w:p>
-    <w:p>
-      <w:pPr>
-        <w:spacing w:before="120" w:after="40"/>
+        <w:keepNext/>
+        <w:spacing w:after="60" w:before="80"/>
       </w:pPr>
       <w:r>
         <w:rPr>
           <w:rFonts w:ascii="Calibri" w:hAnsi="Calibri"/>
           <w:b/>
-          <w:i w:val="0"/>
-          <w:color w:val="1A1A1A"/>
-          <w:sz w:val="24"/>
+          <w:sz w:val="27"/>
         </w:rPr>
-        <w:t>11. For the SAME object, what is the relationship between speed and energy of motion? Use evidence.</w:t>
+        <w:t xml:space="preserve">10. </w:t>
+      </w:r>
+      <w:r>
+        <w:rPr>
+          <w:rFonts w:ascii="Calibri" w:hAnsi="Calibri"/>
+          <w:b w:val="0"/>
+          <w:sz w:val="27"/>
+        </w:rPr>
+        <w:t>The same ball rolls down two ramps. One ramp is low and one ramp is high. On which ramp will the ball most likely have more energy of motion at the bottom?</w:t>
       </w:r>
     </w:p>
     <w:p>
       <w:pPr>
-        <w:spacing w:before="0" w:after="160"/>
-      </w:pPr>
-      <w:r>
-        <w:rPr>
-          <w:rFonts w:ascii="Calibri" w:hAnsi="Calibri"/>
-          <w:b w:val="0"/>
-          <w:i w:val="0"/>
-          <w:color w:val="1A1A1A"/>
-          <w:sz w:val="24"/>
-        </w:rPr>
-        <w:t xml:space="preserve">                                                            </w:t>
-      </w:r>
-    </w:p>
-    <w:p>
-      <w:pPr>
-        <w:spacing w:before="0" w:after="160"/>
-      </w:pPr>
-      <w:r>
-        <w:rPr>
-          <w:rFonts w:ascii="Calibri" w:hAnsi="Calibri"/>
-          <w:b w:val="0"/>
-          <w:i w:val="0"/>
-          <w:color w:val="1A1A1A"/>
-          <w:sz w:val="24"/>
-        </w:rPr>
-        <w:t xml:space="preserve">                                                            </w:t>
-      </w:r>
-    </w:p>
-    <w:p>
-      <w:pPr>
-        <w:spacing w:before="0" w:after="160"/>
-      </w:pPr>
-      <w:r>
-        <w:rPr>
-          <w:rFonts w:ascii="Calibri" w:hAnsi="Calibri"/>
-          <w:b w:val="0"/>
-          <w:i w:val="0"/>
-          <w:color w:val="1A1A1A"/>
-          <w:sz w:val="24"/>
-        </w:rPr>
-        <w:t xml:space="preserve">                                                            </w:t>
-      </w:r>
-    </w:p>
-    <w:p>
-      <w:pPr>
-        <w:spacing w:before="160" w:after="40"/>
+        <w:keepNext/>
+        <w:spacing w:after="40" w:before="0"/>
       </w:pPr>
       <w:r>
         <w:rPr>
           <w:rFonts w:ascii="Calibri" w:hAnsi="Calibri"/>
           <w:b/>
-          <w:i w:val="0"/>
-          <w:color w:val="1F3A5F"/>
           <w:sz w:val="26"/>
         </w:rPr>
-        <w:t>Section 4 — Energy Transfer</w:t>
+        <w:t xml:space="preserve">A. </w:t>
+      </w:r>
+      <w:r>
+        <w:rPr>
+          <w:rFonts w:ascii="Calibri" w:hAnsi="Calibri"/>
+          <w:b w:val="0"/>
+          <w:sz w:val="26"/>
+        </w:rPr>
+        <w:t>The high ramp, because the ball moves faster at the bottom</w:t>
       </w:r>
     </w:p>
     <w:p>
       <w:pPr>
-        <w:spacing w:before="120" w:after="40"/>
+        <w:keepNext/>
+        <w:spacing w:after="40" w:before="0"/>
       </w:pPr>
       <w:r>
         <w:rPr>
           <w:rFonts w:ascii="Calibri" w:hAnsi="Calibri"/>
           <w:b/>
-          <w:i w:val="0"/>
-          <w:color w:val="1A1A1A"/>
-          <w:sz w:val="24"/>
+          <w:sz w:val="26"/>
         </w:rPr>
-        <w:t>12. Which shows sound energy transferring from place to place?</w:t>
+        <w:t xml:space="preserve">B. </w:t>
+      </w:r>
+      <w:r>
+        <w:rPr>
+          <w:rFonts w:ascii="Calibri" w:hAnsi="Calibri"/>
+          <w:b w:val="0"/>
+          <w:sz w:val="26"/>
+        </w:rPr>
+        <w:t>The low ramp, because it is closer to the ground</w:t>
       </w:r>
     </w:p>
     <w:p>
       <w:pPr>
-        <w:spacing w:before="0" w:after="20"/>
-      </w:pPr>
-      <w:r>
-        <w:rPr>
-          <w:rFonts w:ascii="Calibri" w:hAnsi="Calibri"/>
-          <w:b w:val="0"/>
-          <w:i w:val="0"/>
-          <w:color w:val="1A1A1A"/>
-          <w:sz w:val="24"/>
-        </w:rPr>
-        <w:t xml:space="preserve">    a) A bell rings and you hear it across the room</w:t>
-      </w:r>
-    </w:p>
-    <w:p>
-      <w:pPr>
-        <w:spacing w:before="0" w:after="20"/>
-      </w:pPr>
-      <w:r>
-        <w:rPr>
-          <w:rFonts w:ascii="Calibri" w:hAnsi="Calibri"/>
-          <w:b w:val="0"/>
-          <w:i w:val="0"/>
-          <w:color w:val="1A1A1A"/>
-          <w:sz w:val="24"/>
-        </w:rPr>
-        <w:t xml:space="preserve">    b) A ball sits still on the ground</w:t>
-      </w:r>
-    </w:p>
-    <w:p>
-      <w:pPr>
-        <w:spacing w:before="0" w:after="20"/>
-      </w:pPr>
-      <w:r>
-        <w:rPr>
-          <w:rFonts w:ascii="Calibri" w:hAnsi="Calibri"/>
-          <w:b w:val="0"/>
-          <w:i w:val="0"/>
-          <w:color w:val="1A1A1A"/>
-          <w:sz w:val="24"/>
-        </w:rPr>
-        <w:t xml:space="preserve">    c) A block stays on a table</w:t>
-      </w:r>
-    </w:p>
-    <w:p>
-      <w:pPr>
-        <w:spacing w:before="0" w:after="20"/>
-      </w:pPr>
-      <w:r>
-        <w:rPr>
-          <w:rFonts w:ascii="Calibri" w:hAnsi="Calibri"/>
-          <w:b w:val="0"/>
-          <w:i w:val="0"/>
-          <w:color w:val="1A1A1A"/>
-          <w:sz w:val="24"/>
-        </w:rPr>
-        <w:t xml:space="preserve">    d) A ruler rests in a drawer</w:t>
-      </w:r>
-    </w:p>
-    <w:p>
-      <w:pPr>
-        <w:spacing w:before="120" w:after="40"/>
+        <w:keepNext/>
+        <w:spacing w:after="40" w:before="0"/>
       </w:pPr>
       <w:r>
         <w:rPr>
           <w:rFonts w:ascii="Calibri" w:hAnsi="Calibri"/>
           <w:b/>
-          <w:i w:val="0"/>
-          <w:color w:val="1A1A1A"/>
-          <w:sz w:val="24"/>
+          <w:sz w:val="26"/>
         </w:rPr>
-        <w:t>13. Warm water warms a cool spoon. The heat MOVES but stays heat. This is ______.</w:t>
+        <w:t xml:space="preserve">C. </w:t>
+      </w:r>
+      <w:r>
+        <w:rPr>
+          <w:rFonts w:ascii="Calibri" w:hAnsi="Calibri"/>
+          <w:b w:val="0"/>
+          <w:sz w:val="26"/>
+        </w:rPr>
+        <w:t>Both ramps, because it is the same ball</w:t>
       </w:r>
     </w:p>
     <w:p>
       <w:pPr>
-        <w:spacing w:before="0" w:after="20"/>
-      </w:pPr>
-      <w:r>
-        <w:rPr>
-          <w:rFonts w:ascii="Calibri" w:hAnsi="Calibri"/>
-          <w:b w:val="0"/>
-          <w:i w:val="0"/>
-          <w:color w:val="1A1A1A"/>
-          <w:sz w:val="24"/>
-        </w:rPr>
-        <w:t xml:space="preserve">    a) TRANSFER</w:t>
-      </w:r>
-    </w:p>
-    <w:p>
-      <w:pPr>
-        <w:spacing w:before="0" w:after="20"/>
-      </w:pPr>
-      <w:r>
-        <w:rPr>
-          <w:rFonts w:ascii="Calibri" w:hAnsi="Calibri"/>
-          <w:b w:val="0"/>
-          <w:i w:val="0"/>
-          <w:color w:val="1A1A1A"/>
-          <w:sz w:val="24"/>
-        </w:rPr>
-        <w:t xml:space="preserve">    b) TRANSFORMATION</w:t>
-      </w:r>
-    </w:p>
-    <w:p>
-      <w:pPr>
-        <w:spacing w:before="0" w:after="20"/>
-      </w:pPr>
-      <w:r>
-        <w:rPr>
-          <w:rFonts w:ascii="Calibri" w:hAnsi="Calibri"/>
-          <w:b w:val="0"/>
-          <w:i w:val="0"/>
-          <w:color w:val="1A1A1A"/>
-          <w:sz w:val="24"/>
-        </w:rPr>
-        <w:t xml:space="preserve">    c) BOTH</w:t>
-      </w:r>
-    </w:p>
-    <w:p>
-      <w:pPr>
-        <w:spacing w:before="0" w:after="20"/>
-      </w:pPr>
-      <w:r>
-        <w:rPr>
-          <w:rFonts w:ascii="Calibri" w:hAnsi="Calibri"/>
-          <w:b w:val="0"/>
-          <w:i w:val="0"/>
-          <w:color w:val="1A1A1A"/>
-          <w:sz w:val="24"/>
-        </w:rPr>
-        <w:t xml:space="preserve">    d) neither</w:t>
-      </w:r>
-    </w:p>
-    <w:p>
-      <w:pPr>
-        <w:spacing w:before="120" w:after="40"/>
+        <w:spacing w:after="40" w:before="0"/>
       </w:pPr>
       <w:r>
         <w:rPr>
           <w:rFonts w:ascii="Calibri" w:hAnsi="Calibri"/>
           <w:b/>
-          <w:i w:val="0"/>
-          <w:color w:val="1A1A1A"/>
-          <w:sz w:val="24"/>
+          <w:sz w:val="26"/>
         </w:rPr>
-        <w:t>14. Which are evidence that energy TRANSFERRED from place to place? Circle ALL correct.</w:t>
+        <w:t xml:space="preserve">D. </w:t>
+      </w:r>
+      <w:r>
+        <w:rPr>
+          <w:rFonts w:ascii="Calibri" w:hAnsi="Calibri"/>
+          <w:b w:val="0"/>
+          <w:sz w:val="26"/>
+        </w:rPr>
+        <w:t>Neither ramp, because ramp height does not matter</w:t>
       </w:r>
     </w:p>
     <w:p>
       <w:pPr>
-        <w:spacing w:before="0" w:after="20"/>
-      </w:pPr>
-      <w:r>
-        <w:rPr>
-          <w:rFonts w:ascii="Calibri" w:hAnsi="Calibri"/>
-          <w:b w:val="0"/>
-          <w:i w:val="0"/>
-          <w:color w:val="1A1A1A"/>
-          <w:sz w:val="24"/>
-        </w:rPr>
-        <w:t xml:space="preserve">    a) You hear a bell from far away</w:t>
-      </w:r>
-    </w:p>
-    <w:p>
-      <w:pPr>
-        <w:spacing w:before="0" w:after="20"/>
-      </w:pPr>
-      <w:r>
-        <w:rPr>
-          <w:rFonts w:ascii="Calibri" w:hAnsi="Calibri"/>
-          <w:b w:val="0"/>
-          <w:i w:val="0"/>
-          <w:color w:val="1A1A1A"/>
-          <w:sz w:val="24"/>
-        </w:rPr>
-        <w:t xml:space="preserve">    b) A book stays closed on a desk</w:t>
-      </w:r>
-    </w:p>
-    <w:p>
-      <w:pPr>
-        <w:spacing w:before="0" w:after="20"/>
-      </w:pPr>
-      <w:r>
-        <w:rPr>
-          <w:rFonts w:ascii="Calibri" w:hAnsi="Calibri"/>
-          <w:b w:val="0"/>
-          <w:i w:val="0"/>
-          <w:color w:val="1A1A1A"/>
-          <w:sz w:val="24"/>
-        </w:rPr>
-        <w:t xml:space="preserve">    c) You flip a switch and the room lights up</w:t>
-      </w:r>
-    </w:p>
-    <w:p>
-      <w:pPr>
-        <w:spacing w:before="0" w:after="20"/>
-      </w:pPr>
-      <w:r>
-        <w:rPr>
-          <w:rFonts w:ascii="Calibri" w:hAnsi="Calibri"/>
-          <w:b w:val="0"/>
-          <w:i w:val="0"/>
-          <w:color w:val="1A1A1A"/>
-          <w:sz w:val="24"/>
-        </w:rPr>
-        <w:t xml:space="preserve">    d) A pencil does not move</w:t>
-      </w:r>
-    </w:p>
-    <w:p>
-      <w:pPr>
-        <w:spacing w:before="0" w:after="20"/>
-      </w:pPr>
-      <w:r>
-        <w:rPr>
-          <w:rFonts w:ascii="Calibri" w:hAnsi="Calibri"/>
-          <w:b w:val="0"/>
-          <w:i w:val="0"/>
-          <w:color w:val="1A1A1A"/>
-          <w:sz w:val="24"/>
-        </w:rPr>
-        <w:t xml:space="preserve">    e) A backpack left in the sun gets warm</w:t>
-      </w:r>
-    </w:p>
-    <w:p>
-      <w:pPr>
-        <w:spacing w:before="120" w:after="40"/>
+        <w:keepNext/>
+        <w:spacing w:after="60" w:before="80"/>
       </w:pPr>
       <w:r>
         <w:rPr>
           <w:rFonts w:ascii="Calibri" w:hAnsi="Calibri"/>
           <w:b/>
-          <w:i w:val="0"/>
-          <w:color w:val="1A1A1A"/>
-          <w:sz w:val="24"/>
+          <w:sz w:val="27"/>
         </w:rPr>
-        <w:t>15. A flashlight turns on. Stored energy in the battery becomes light. This is ______.</w:t>
+        <w:t xml:space="preserve">11. </w:t>
+      </w:r>
+      <w:r>
+        <w:rPr>
+          <w:rFonts w:ascii="Calibri" w:hAnsi="Calibri"/>
+          <w:b w:val="0"/>
+          <w:sz w:val="27"/>
+        </w:rPr>
+        <w:t>A battery in a flashlight that is turned off is an example of stored energy. What can stored energy do?</w:t>
       </w:r>
     </w:p>
     <w:p>
       <w:pPr>
-        <w:spacing w:before="0" w:after="20"/>
-      </w:pPr>
-      <w:r>
-        <w:rPr>
-          <w:rFonts w:ascii="Calibri" w:hAnsi="Calibri"/>
-          <w:b w:val="0"/>
-          <w:i w:val="0"/>
-          <w:color w:val="1A1A1A"/>
-          <w:sz w:val="24"/>
-        </w:rPr>
-        <w:t xml:space="preserve">    a) TRANSFER</w:t>
-      </w:r>
-    </w:p>
-    <w:p>
-      <w:pPr>
-        <w:spacing w:before="0" w:after="20"/>
-      </w:pPr>
-      <w:r>
-        <w:rPr>
-          <w:rFonts w:ascii="Calibri" w:hAnsi="Calibri"/>
-          <w:b w:val="0"/>
-          <w:i w:val="0"/>
-          <w:color w:val="1A1A1A"/>
-          <w:sz w:val="24"/>
-        </w:rPr>
-        <w:t xml:space="preserve">    b) TRANSFORMATION</w:t>
-      </w:r>
-    </w:p>
-    <w:p>
-      <w:pPr>
-        <w:spacing w:before="0" w:after="20"/>
-      </w:pPr>
-      <w:r>
-        <w:rPr>
-          <w:rFonts w:ascii="Calibri" w:hAnsi="Calibri"/>
-          <w:b w:val="0"/>
-          <w:i w:val="0"/>
-          <w:color w:val="1A1A1A"/>
-          <w:sz w:val="24"/>
-        </w:rPr>
-        <w:t xml:space="preserve">    c) neither</w:t>
-      </w:r>
-    </w:p>
-    <w:p>
-      <w:pPr>
-        <w:spacing w:before="120" w:after="40"/>
+        <w:keepNext/>
+        <w:spacing w:after="40" w:before="0"/>
       </w:pPr>
       <w:r>
         <w:rPr>
           <w:rFonts w:ascii="Calibri" w:hAnsi="Calibri"/>
           <w:b/>
-          <w:i w:val="0"/>
-          <w:color w:val="1A1A1A"/>
-          <w:sz w:val="24"/>
+          <w:sz w:val="26"/>
         </w:rPr>
-        <w:t>16. Label the energy change in a flashlight:</w:t>
+        <w:t xml:space="preserve">A. </w:t>
+      </w:r>
+      <w:r>
+        <w:rPr>
+          <w:rFonts w:ascii="Calibri" w:hAnsi="Calibri"/>
+          <w:b w:val="0"/>
+          <w:sz w:val="26"/>
+        </w:rPr>
+        <w:t>It disappears as soon as the flashlight is turned off</w:t>
       </w:r>
     </w:p>
     <w:p>
       <w:pPr>
-        <w:spacing w:before="0" w:after="40"/>
-      </w:pPr>
-      <w:r>
-        <w:rPr>
-          <w:rFonts w:ascii="Calibri" w:hAnsi="Calibri"/>
-          <w:b w:val="0"/>
-          <w:i w:val="0"/>
-          <w:color w:val="1A1A1A"/>
-          <w:sz w:val="24"/>
-        </w:rPr>
-        <w:t xml:space="preserve">    INPUT: ________________  →  OUTPUT: ________________</w:t>
-      </w:r>
-    </w:p>
-    <w:p>
-      <w:pPr>
-        <w:spacing w:before="160" w:after="40"/>
+        <w:keepNext/>
+        <w:spacing w:after="40" w:before="0"/>
       </w:pPr>
       <w:r>
         <w:rPr>
           <w:rFonts w:ascii="Calibri" w:hAnsi="Calibri"/>
           <w:b/>
-          <w:i w:val="0"/>
-          <w:color w:val="1F3A5F"/>
           <w:sz w:val="26"/>
         </w:rPr>
-        <w:t>Section 5 — Collisions</w:t>
+        <w:t xml:space="preserve">B. </w:t>
+      </w:r>
+      <w:r>
+        <w:rPr>
+          <w:rFonts w:ascii="Calibri" w:hAnsi="Calibri"/>
+          <w:b w:val="0"/>
+          <w:sz w:val="26"/>
+        </w:rPr>
+        <w:t>It can only be stored inside a rubber band</w:t>
       </w:r>
     </w:p>
     <w:p>
       <w:pPr>
-        <w:spacing w:before="120" w:after="40"/>
+        <w:keepNext/>
+        <w:spacing w:after="40" w:before="0"/>
       </w:pPr>
       <w:r>
         <w:rPr>
           <w:rFonts w:ascii="Calibri" w:hAnsi="Calibri"/>
           <w:b/>
-          <w:i w:val="0"/>
-          <w:color w:val="1A1A1A"/>
-          <w:sz w:val="24"/>
+          <w:sz w:val="26"/>
         </w:rPr>
-        <w:t>17. During a collision, what happens to the energy of motion?</w:t>
+        <w:t xml:space="preserve">C. </w:t>
+      </w:r>
+      <w:r>
+        <w:rPr>
+          <w:rFonts w:ascii="Calibri" w:hAnsi="Calibri"/>
+          <w:b w:val="0"/>
+          <w:sz w:val="26"/>
+        </w:rPr>
+        <w:t>It always turns into light right away</w:t>
       </w:r>
     </w:p>
     <w:p>
       <w:pPr>
-        <w:spacing w:before="0" w:after="20"/>
-      </w:pPr>
-      <w:r>
-        <w:rPr>
-          <w:rFonts w:ascii="Calibri" w:hAnsi="Calibri"/>
-          <w:b w:val="0"/>
-          <w:i w:val="0"/>
-          <w:color w:val="1A1A1A"/>
-          <w:sz w:val="24"/>
-        </w:rPr>
-        <w:t xml:space="preserve">    a) It disappears</w:t>
-      </w:r>
-    </w:p>
-    <w:p>
-      <w:pPr>
-        <w:spacing w:before="0" w:after="20"/>
-      </w:pPr>
-      <w:r>
-        <w:rPr>
-          <w:rFonts w:ascii="Calibri" w:hAnsi="Calibri"/>
-          <w:b w:val="0"/>
-          <w:i w:val="0"/>
-          <w:color w:val="1A1A1A"/>
-          <w:sz w:val="24"/>
-        </w:rPr>
-        <w:t xml:space="preserve">    b) It transfers to the target, and some becomes sound</w:t>
-      </w:r>
-    </w:p>
-    <w:p>
-      <w:pPr>
-        <w:spacing w:before="0" w:after="20"/>
-      </w:pPr>
-      <w:r>
-        <w:rPr>
-          <w:rFonts w:ascii="Calibri" w:hAnsi="Calibri"/>
-          <w:b w:val="0"/>
-          <w:i w:val="0"/>
-          <w:color w:val="1A1A1A"/>
-          <w:sz w:val="24"/>
-        </w:rPr>
-        <w:t xml:space="preserve">    c) It becomes cold only</w:t>
-      </w:r>
-    </w:p>
-    <w:p>
-      <w:pPr>
-        <w:spacing w:before="0" w:after="20"/>
-      </w:pPr>
-      <w:r>
-        <w:rPr>
-          <w:rFonts w:ascii="Calibri" w:hAnsi="Calibri"/>
-          <w:b w:val="0"/>
-          <w:i w:val="0"/>
-          <w:color w:val="1A1A1A"/>
-          <w:sz w:val="24"/>
-        </w:rPr>
-        <w:t xml:space="preserve">    d) Nothing happens</w:t>
-      </w:r>
-    </w:p>
-    <w:p>
-      <w:pPr>
-        <w:spacing w:before="120" w:after="40"/>
+        <w:spacing w:after="40" w:before="0"/>
       </w:pPr>
       <w:r>
         <w:rPr>
           <w:rFonts w:ascii="Calibri" w:hAnsi="Calibri"/>
           <w:b/>
-          <w:i w:val="0"/>
-          <w:color w:val="1A1A1A"/>
-          <w:sz w:val="24"/>
+          <w:sz w:val="26"/>
         </w:rPr>
-        <w:t>18. Read the table: a toy car rolls into a stack of blocks.</w:t>
+        <w:t xml:space="preserve">D. </w:t>
       </w:r>
-    </w:p>
-    <w:tbl>
-      <w:tblPr>
-        <w:tblW w:type="auto" w:w="0"/>
-        <w:jc w:val="center"/>
-        <w:tblLook w:firstColumn="1" w:firstRow="1" w:lastColumn="0" w:lastRow="0" w:noHBand="0" w:noVBand="1" w:val="04A0"/>
-      </w:tblPr>
-      <w:tblGrid>
-        <w:gridCol w:w="3504"/>
-        <w:gridCol w:w="3504"/>
-        <w:gridCol w:w="3504"/>
-      </w:tblGrid>
-      <w:tr>
-        <w:tc>
-          <w:tcPr>
-            <w:tcW w:type="dxa" w:w="3504"/>
-            <w:shd w:val="clear" w:color="auto" w:fill="1F3A5F"/>
-          </w:tcPr>
-          <w:p>
-            <w:r/>
-            <w:r>
-              <w:rPr>
-                <w:rFonts w:ascii="Calibri" w:hAnsi="Calibri"/>
-                <w:b/>
-                <w:i w:val="0"/>
-                <w:color w:val="FFFFFF"/>
-                <w:sz w:val="24"/>
-              </w:rPr>
-              <w:t>Car</w:t>
-            </w:r>
-          </w:p>
-        </w:tc>
-        <w:tc>
-          <w:tcPr>
-            <w:tcW w:type="dxa" w:w="3504"/>
-            <w:shd w:val="clear" w:color="auto" w:fill="1F3A5F"/>
-          </w:tcPr>
-          <w:p>
-            <w:r/>
-            <w:r>
-              <w:rPr>
-                <w:rFonts w:ascii="Calibri" w:hAnsi="Calibri"/>
-                <w:b/>
-                <w:i w:val="0"/>
-                <w:color w:val="FFFFFF"/>
-                <w:sz w:val="24"/>
-              </w:rPr>
-              <w:t>Weight changed?</w:t>
-            </w:r>
-          </w:p>
-        </w:tc>
-        <w:tc>
-          <w:tcPr>
-            <w:tcW w:type="dxa" w:w="3504"/>
-            <w:shd w:val="clear" w:color="auto" w:fill="1F3A5F"/>
-          </w:tcPr>
-          <w:p>
-            <w:r/>
-            <w:r>
-              <w:rPr>
-                <w:rFonts w:ascii="Calibri" w:hAnsi="Calibri"/>
-                <w:b/>
-                <w:i w:val="0"/>
-                <w:color w:val="FFFFFF"/>
-                <w:sz w:val="24"/>
-              </w:rPr>
-              <w:t>Blocks knocked over</w:t>
-            </w:r>
-          </w:p>
-        </w:tc>
-      </w:tr>
-      <w:tr>
-        <w:tc>
-          <w:tcPr>
-            <w:tcW w:type="dxa" w:w="3504"/>
-          </w:tcPr>
-          <w:p>
-            <w:r/>
-            <w:r>
-              <w:rPr>
-                <w:rFonts w:ascii="Calibri" w:hAnsi="Calibri"/>
-                <w:b w:val="0"/>
-                <w:i w:val="0"/>
-                <w:color w:val="1A1A1A"/>
-                <w:sz w:val="24"/>
-              </w:rPr>
-              <w:t>Test 1</w:t>
-            </w:r>
-          </w:p>
-        </w:tc>
-        <w:tc>
-          <w:tcPr>
-            <w:tcW w:type="dxa" w:w="3504"/>
-          </w:tcPr>
-          <w:p>
-            <w:r/>
-            <w:r>
-              <w:rPr>
-                <w:rFonts w:ascii="Calibri" w:hAnsi="Calibri"/>
-                <w:b w:val="0"/>
-                <w:i w:val="0"/>
-                <w:color w:val="1A1A1A"/>
-                <w:sz w:val="24"/>
-              </w:rPr>
-              <w:t>no extra weight</w:t>
-            </w:r>
-          </w:p>
-        </w:tc>
-        <w:tc>
-          <w:tcPr>
-            <w:tcW w:type="dxa" w:w="3504"/>
-          </w:tcPr>
-          <w:p>
-            <w:r/>
-            <w:r>
-              <w:rPr>
-                <w:rFonts w:ascii="Calibri" w:hAnsi="Calibri"/>
-                <w:b w:val="0"/>
-                <w:i w:val="0"/>
-                <w:color w:val="1A1A1A"/>
-                <w:sz w:val="24"/>
-              </w:rPr>
-              <w:t>1 block</w:t>
-            </w:r>
-          </w:p>
-        </w:tc>
-      </w:tr>
-      <w:tr>
-        <w:tc>
-          <w:tcPr>
-            <w:tcW w:type="dxa" w:w="3504"/>
-          </w:tcPr>
-          <w:p>
-            <w:r/>
-            <w:r>
-              <w:rPr>
-                <w:rFonts w:ascii="Calibri" w:hAnsi="Calibri"/>
-                <w:b w:val="0"/>
-                <w:i w:val="0"/>
-                <w:color w:val="1A1A1A"/>
-                <w:sz w:val="24"/>
-              </w:rPr>
-              <w:t>Test 2</w:t>
-            </w:r>
-          </w:p>
-        </w:tc>
-        <w:tc>
-          <w:tcPr>
-            <w:tcW w:type="dxa" w:w="3504"/>
-          </w:tcPr>
-          <w:p>
-            <w:r/>
-            <w:r>
-              <w:rPr>
-                <w:rFonts w:ascii="Calibri" w:hAnsi="Calibri"/>
-                <w:b w:val="0"/>
-                <w:i w:val="0"/>
-                <w:color w:val="1A1A1A"/>
-                <w:sz w:val="24"/>
-              </w:rPr>
-              <w:t>added weight (ONLY change)</w:t>
-            </w:r>
-          </w:p>
-        </w:tc>
-        <w:tc>
-          <w:tcPr>
-            <w:tcW w:type="dxa" w:w="3504"/>
-          </w:tcPr>
-          <w:p>
-            <w:r/>
-            <w:r>
-              <w:rPr>
-                <w:rFonts w:ascii="Calibri" w:hAnsi="Calibri"/>
-                <w:b w:val="0"/>
-                <w:i w:val="0"/>
-                <w:color w:val="1A1A1A"/>
-                <w:sz w:val="24"/>
-              </w:rPr>
-              <w:t>2 blocks</w:t>
-            </w:r>
-          </w:p>
-        </w:tc>
-      </w:tr>
-    </w:tbl>
-    <w:p>
-      <w:pPr>
-        <w:spacing w:before="0" w:after="40"/>
-      </w:pPr>
       <w:r>
         <w:rPr>
           <w:rFonts w:ascii="Calibri" w:hAnsi="Calibri"/>
           <w:b w:val="0"/>
-          <w:i w:val="0"/>
-          <w:color w:val="1A1A1A"/>
-          <w:sz w:val="24"/>
+          <w:sz w:val="26"/>
         </w:rPr>
-        <w:t>Explain the result using energy:</w:t>
+        <w:t>It can cause a change later, when the flashlight is turned on</w:t>
       </w:r>
     </w:p>
     <w:p>
       <w:pPr>
-        <w:spacing w:before="0" w:after="160"/>
+        <w:keepNext/>
+        <w:spacing w:after="80"/>
+        <w:jc w:val="center"/>
       </w:pPr>
       <w:r>
-        <w:rPr>
-          <w:rFonts w:ascii="Calibri" w:hAnsi="Calibri"/>
-          <w:b w:val="0"/>
-          <w:i w:val="0"/>
-          <w:color w:val="1A1A1A"/>
-          <w:sz w:val="24"/>
-        </w:rPr>
-        <w:t xml:space="preserve">                                                            </w:t>
+        <w:drawing>
+          <wp:inline xmlns:a="http://schemas.openxmlformats.org/drawingml/2006/main" xmlns:pic="http://schemas.openxmlformats.org/drawingml/2006/picture">
+            <wp:extent cx="5486400" cy="1463040"/>
+            <wp:docPr id="2" name="Picture 2"/>
+            <wp:cNvGraphicFramePr>
+              <a:graphicFrameLocks noChangeAspect="1"/>
+            </wp:cNvGraphicFramePr>
+            <a:graphic>
+              <a:graphicData uri="http://schemas.openxmlformats.org/drawingml/2006/picture">
+                <pic:pic>
+                  <pic:nvPicPr>
+                    <pic:cNvPr id="0" name="collision.png"/>
+                    <pic:cNvPicPr/>
+                  </pic:nvPicPr>
+                  <pic:blipFill>
+                    <a:blip r:embed="rId10"/>
+                    <a:stretch>
+                      <a:fillRect/>
+                    </a:stretch>
+                  </pic:blipFill>
+                  <pic:spPr>
+                    <a:xfrm>
+                      <a:off x="0" y="0"/>
+                      <a:ext cx="5486400" cy="1463040"/>
+                    </a:xfrm>
+                    <a:prstGeom prst="rect"/>
+                  </pic:spPr>
+                </pic:pic>
+              </a:graphicData>
+            </a:graphic>
+          </wp:inline>
+        </w:drawing>
       </w:r>
     </w:p>
     <w:p>
       <w:pPr>
-        <w:spacing w:before="0" w:after="160"/>
-      </w:pPr>
-      <w:r>
-        <w:rPr>
-          <w:rFonts w:ascii="Calibri" w:hAnsi="Calibri"/>
-          <w:b w:val="0"/>
-          <w:i w:val="0"/>
-          <w:color w:val="1A1A1A"/>
-          <w:sz w:val="24"/>
-        </w:rPr>
-        <w:t xml:space="preserve">                                                            </w:t>
-      </w:r>
-    </w:p>
-    <w:p>
-      <w:pPr>
-        <w:spacing w:before="120" w:after="40"/>
+        <w:keepNext/>
+        <w:spacing w:after="60" w:before="80"/>
       </w:pPr>
       <w:r>
         <w:rPr>
           <w:rFonts w:ascii="Calibri" w:hAnsi="Calibri"/>
           <w:b/>
-          <w:i w:val="0"/>
-          <w:color w:val="1A1A1A"/>
-          <w:sz w:val="24"/>
+          <w:sz w:val="27"/>
         </w:rPr>
-        <w:t>19. Is the test in item 18 a fair test? Why or why not? Predict what happens if you add even more weight.</w:t>
+        <w:t xml:space="preserve">12. </w:t>
+      </w:r>
+      <w:r>
+        <w:rPr>
+          <w:rFonts w:ascii="Calibri" w:hAnsi="Calibri"/>
+          <w:b w:val="0"/>
+          <w:sz w:val="27"/>
+        </w:rPr>
+        <w:t>After the crash, the rolling car stops and the target moves. What does this change tell us?</w:t>
       </w:r>
     </w:p>
     <w:p>
       <w:pPr>
-        <w:spacing w:before="0" w:after="160"/>
-      </w:pPr>
-      <w:r>
-        <w:rPr>
-          <w:rFonts w:ascii="Calibri" w:hAnsi="Calibri"/>
-          <w:b w:val="0"/>
-          <w:i w:val="0"/>
-          <w:color w:val="1A1A1A"/>
-          <w:sz w:val="24"/>
-        </w:rPr>
-        <w:t xml:space="preserve">                                                            </w:t>
-      </w:r>
-    </w:p>
-    <w:p>
-      <w:pPr>
-        <w:spacing w:before="0" w:after="160"/>
-      </w:pPr>
-      <w:r>
-        <w:rPr>
-          <w:rFonts w:ascii="Calibri" w:hAnsi="Calibri"/>
-          <w:b w:val="0"/>
-          <w:i w:val="0"/>
-          <w:color w:val="1A1A1A"/>
-          <w:sz w:val="24"/>
-        </w:rPr>
-        <w:t xml:space="preserve">                                                            </w:t>
-      </w:r>
-    </w:p>
-    <w:p>
-      <w:pPr>
-        <w:spacing w:before="0" w:after="160"/>
-      </w:pPr>
-      <w:r>
-        <w:rPr>
-          <w:rFonts w:ascii="Calibri" w:hAnsi="Calibri"/>
-          <w:b w:val="0"/>
-          <w:i w:val="0"/>
-          <w:color w:val="1A1A1A"/>
-          <w:sz w:val="24"/>
-        </w:rPr>
-        <w:t xml:space="preserve">                                                            </w:t>
-      </w:r>
-    </w:p>
-    <w:p>
-      <w:pPr>
-        <w:spacing w:before="120" w:after="40"/>
+        <w:keepNext/>
+        <w:spacing w:after="40" w:before="0"/>
       </w:pPr>
       <w:r>
         <w:rPr>
           <w:rFonts w:ascii="Calibri" w:hAnsi="Calibri"/>
           <w:b/>
-          <w:i w:val="0"/>
-          <w:color w:val="1A1A1A"/>
-          <w:sz w:val="24"/>
+          <w:sz w:val="26"/>
         </w:rPr>
-        <w:t>20. After a collision, the energy ______.</w:t>
+        <w:t xml:space="preserve">A. </w:t>
+      </w:r>
+      <w:r>
+        <w:rPr>
+          <w:rFonts w:ascii="Calibri" w:hAnsi="Calibri"/>
+          <w:b w:val="0"/>
+          <w:sz w:val="26"/>
+        </w:rPr>
+        <w:t>The energy disappeared when the car stopped</w:t>
       </w:r>
     </w:p>
     <w:p>
       <w:pPr>
-        <w:spacing w:before="0" w:after="20"/>
-      </w:pPr>
-      <w:r>
-        <w:rPr>
-          <w:rFonts w:ascii="Calibri" w:hAnsi="Calibri"/>
-          <w:b w:val="0"/>
-          <w:i w:val="0"/>
-          <w:color w:val="1A1A1A"/>
-          <w:sz w:val="24"/>
-        </w:rPr>
-        <w:t xml:space="preserve">    a) is gone forever</w:t>
-      </w:r>
-    </w:p>
-    <w:p>
-      <w:pPr>
-        <w:spacing w:before="0" w:after="20"/>
-      </w:pPr>
-      <w:r>
-        <w:rPr>
-          <w:rFonts w:ascii="Calibri" w:hAnsi="Calibri"/>
-          <w:b w:val="0"/>
-          <w:i w:val="0"/>
-          <w:color w:val="1A1A1A"/>
-          <w:sz w:val="24"/>
-        </w:rPr>
-        <w:t xml:space="preserve">    b) turns into light only</w:t>
-      </w:r>
-    </w:p>
-    <w:p>
-      <w:pPr>
-        <w:spacing w:before="0" w:after="20"/>
-      </w:pPr>
-      <w:r>
-        <w:rPr>
-          <w:rFonts w:ascii="Calibri" w:hAnsi="Calibri"/>
-          <w:b w:val="0"/>
-          <w:i w:val="0"/>
-          <w:color w:val="1A1A1A"/>
-          <w:sz w:val="24"/>
-        </w:rPr>
-        <w:t xml:space="preserve">    c) does not disappear — it transfers, and some becomes sound</w:t>
-      </w:r>
-    </w:p>
-    <w:p>
-      <w:pPr>
-        <w:spacing w:before="0" w:after="20"/>
-      </w:pPr>
-      <w:r>
-        <w:rPr>
-          <w:rFonts w:ascii="Calibri" w:hAnsi="Calibri"/>
-          <w:b w:val="0"/>
-          <w:i w:val="0"/>
-          <w:color w:val="1A1A1A"/>
-          <w:sz w:val="24"/>
-        </w:rPr>
-        <w:t xml:space="preserve">    d) becomes nothing</w:t>
-      </w:r>
-    </w:p>
-    <w:p>
-      <w:pPr>
-        <w:spacing w:before="160" w:after="40"/>
+        <w:keepNext/>
+        <w:spacing w:after="40" w:before="0"/>
       </w:pPr>
       <w:r>
         <w:rPr>
           <w:rFonts w:ascii="Calibri" w:hAnsi="Calibri"/>
           <w:b/>
-          <w:i w:val="0"/>
-          <w:color w:val="1F3A5F"/>
           <w:sz w:val="26"/>
         </w:rPr>
-        <w:t>Section 6 — Transformations and Engineering</w:t>
+        <w:t xml:space="preserve">B. </w:t>
+      </w:r>
+      <w:r>
+        <w:rPr>
+          <w:rFonts w:ascii="Calibri" w:hAnsi="Calibri"/>
+          <w:b w:val="0"/>
+          <w:sz w:val="26"/>
+        </w:rPr>
+        <w:t>Energy of motion transferred from the car to the target</w:t>
       </w:r>
     </w:p>
     <w:p>
       <w:pPr>
-        <w:spacing w:before="120" w:after="40"/>
+        <w:keepNext/>
+        <w:spacing w:after="40" w:before="0"/>
       </w:pPr>
       <w:r>
         <w:rPr>
           <w:rFonts w:ascii="Calibri" w:hAnsi="Calibri"/>
           <w:b/>
-          <w:i w:val="0"/>
-          <w:color w:val="1A1A1A"/>
-          <w:sz w:val="24"/>
+          <w:sz w:val="26"/>
         </w:rPr>
-        <w:t>21. A domino falls and clicks. Motion passes to the next domino AND some becomes sound. This is ______.</w:t>
+        <w:t xml:space="preserve">C. </w:t>
+      </w:r>
+      <w:r>
+        <w:rPr>
+          <w:rFonts w:ascii="Calibri" w:hAnsi="Calibri"/>
+          <w:b w:val="0"/>
+          <w:sz w:val="26"/>
+        </w:rPr>
+        <w:t>The target made its own energy</w:t>
       </w:r>
     </w:p>
     <w:p>
       <w:pPr>
-        <w:spacing w:before="0" w:after="20"/>
-      </w:pPr>
-      <w:r>
-        <w:rPr>
-          <w:rFonts w:ascii="Calibri" w:hAnsi="Calibri"/>
-          <w:b w:val="0"/>
-          <w:i w:val="0"/>
-          <w:color w:val="1A1A1A"/>
-          <w:sz w:val="24"/>
-        </w:rPr>
-        <w:t xml:space="preserve">    a) TRANSFER only</w:t>
-      </w:r>
-    </w:p>
-    <w:p>
-      <w:pPr>
-        <w:spacing w:before="0" w:after="20"/>
-      </w:pPr>
-      <w:r>
-        <w:rPr>
-          <w:rFonts w:ascii="Calibri" w:hAnsi="Calibri"/>
-          <w:b w:val="0"/>
-          <w:i w:val="0"/>
-          <w:color w:val="1A1A1A"/>
-          <w:sz w:val="24"/>
-        </w:rPr>
-        <w:t xml:space="preserve">    b) TRANSFORMATION only</w:t>
-      </w:r>
-    </w:p>
-    <w:p>
-      <w:pPr>
-        <w:spacing w:before="0" w:after="20"/>
-      </w:pPr>
-      <w:r>
-        <w:rPr>
-          <w:rFonts w:ascii="Calibri" w:hAnsi="Calibri"/>
-          <w:b w:val="0"/>
-          <w:i w:val="0"/>
-          <w:color w:val="1A1A1A"/>
-          <w:sz w:val="24"/>
-        </w:rPr>
-        <w:t xml:space="preserve">    c) BOTH</w:t>
-      </w:r>
-    </w:p>
-    <w:p>
-      <w:pPr>
-        <w:spacing w:before="0" w:after="20"/>
-      </w:pPr>
-      <w:r>
-        <w:rPr>
-          <w:rFonts w:ascii="Calibri" w:hAnsi="Calibri"/>
-          <w:b w:val="0"/>
-          <w:i w:val="0"/>
-          <w:color w:val="1A1A1A"/>
-          <w:sz w:val="24"/>
-        </w:rPr>
-        <w:t xml:space="preserve">    d) neither</w:t>
-      </w:r>
-    </w:p>
-    <w:p>
-      <w:pPr>
-        <w:spacing w:before="120" w:after="40"/>
+        <w:spacing w:after="40" w:before="0"/>
       </w:pPr>
       <w:r>
         <w:rPr>
           <w:rFonts w:ascii="Calibri" w:hAnsi="Calibri"/>
           <w:b/>
-          <w:i w:val="0"/>
-          <w:color w:val="1A1A1A"/>
-          <w:sz w:val="24"/>
+          <w:sz w:val="26"/>
         </w:rPr>
-        <w:t>22. Draw a line to match each word to its meaning.</w:t>
+        <w:t xml:space="preserve">D. </w:t>
+      </w:r>
+      <w:r>
+        <w:rPr>
+          <w:rFonts w:ascii="Calibri" w:hAnsi="Calibri"/>
+          <w:b w:val="0"/>
+          <w:sz w:val="26"/>
+        </w:rPr>
+        <w:t>No energy was involved in the crash</w:t>
       </w:r>
     </w:p>
     <w:p>
       <w:pPr>
-        <w:spacing w:before="0" w:after="40"/>
+        <w:keepNext/>
+        <w:spacing w:after="80"/>
+        <w:jc w:val="center"/>
       </w:pPr>
       <w:r>
-        <w:rPr>
-          <w:rFonts w:ascii="Calibri" w:hAnsi="Calibri"/>
-          <w:b w:val="0"/>
-          <w:i w:val="0"/>
-          <w:color w:val="1A1A1A"/>
-          <w:sz w:val="24"/>
-        </w:rPr>
-        <w:t xml:space="preserve">    criteria        the limits (materials, time, safety)</w:t>
+        <w:drawing>
+          <wp:inline xmlns:a="http://schemas.openxmlformats.org/drawingml/2006/main" xmlns:pic="http://schemas.openxmlformats.org/drawingml/2006/picture">
+            <wp:extent cx="5486400" cy="1097280"/>
+            <wp:docPr id="3" name="Picture 3"/>
+            <wp:cNvGraphicFramePr>
+              <a:graphicFrameLocks noChangeAspect="1"/>
+            </wp:cNvGraphicFramePr>
+            <a:graphic>
+              <a:graphicData uri="http://schemas.openxmlformats.org/drawingml/2006/picture">
+                <pic:pic>
+                  <pic:nvPicPr>
+                    <pic:cNvPr id="0" name="source-path.png"/>
+                    <pic:cNvPicPr/>
+                  </pic:nvPicPr>
+                  <pic:blipFill>
+                    <a:blip r:embed="rId11"/>
+                    <a:stretch>
+                      <a:fillRect/>
+                    </a:stretch>
+                  </pic:blipFill>
+                  <pic:spPr>
+                    <a:xfrm>
+                      <a:off x="0" y="0"/>
+                      <a:ext cx="5486400" cy="1097280"/>
+                    </a:xfrm>
+                    <a:prstGeom prst="rect"/>
+                  </pic:spPr>
+                </pic:pic>
+              </a:graphicData>
+            </a:graphic>
+          </wp:inline>
+        </w:drawing>
       </w:r>
     </w:p>
     <w:p>
       <w:pPr>
-        <w:spacing w:before="0" w:after="40"/>
-      </w:pPr>
-      <w:r>
-        <w:rPr>
-          <w:rFonts w:ascii="Calibri" w:hAnsi="Calibri"/>
-          <w:b w:val="0"/>
-          <w:i w:val="0"/>
-          <w:color w:val="1A1A1A"/>
-          <w:sz w:val="24"/>
-        </w:rPr>
-        <w:t xml:space="preserve">    constraints     what a good solution must do</w:t>
-      </w:r>
-    </w:p>
-    <w:p>
-      <w:pPr>
-        <w:spacing w:before="0" w:after="40"/>
-      </w:pPr>
-      <w:r>
-        <w:rPr>
-          <w:rFonts w:ascii="Calibri" w:hAnsi="Calibri"/>
-          <w:b w:val="0"/>
-          <w:i w:val="0"/>
-          <w:color w:val="1A1A1A"/>
-          <w:sz w:val="24"/>
-        </w:rPr>
-        <w:t xml:space="preserve">    refine          to improve using test evidence</w:t>
-      </w:r>
-    </w:p>
-    <w:p>
-      <w:pPr>
-        <w:spacing w:before="120" w:after="40"/>
+        <w:keepNext/>
+        <w:spacing w:after="60" w:before="80"/>
       </w:pPr>
       <w:r>
         <w:rPr>
           <w:rFonts w:ascii="Calibri" w:hAnsi="Calibri"/>
           <w:b/>
-          <w:i w:val="0"/>
-          <w:color w:val="1A1A1A"/>
-          <w:sz w:val="24"/>
+          <w:sz w:val="27"/>
         </w:rPr>
-        <w:t>23. Pick ONE device (flashlight, buzzer, or ramp toy). Write a claim about its energy change, give evidence, and explain your reasoning. Use "supports," not "proves."</w:t>
+        <w:t xml:space="preserve">13. </w:t>
+      </w:r>
+      <w:r>
+        <w:rPr>
+          <w:rFonts w:ascii="Calibri" w:hAnsi="Calibri"/>
+          <w:b w:val="0"/>
+          <w:sz w:val="27"/>
+        </w:rPr>
+        <w:t>In the diagram, energy leaves the tapped cup, travels through the air, and makes the paper move. What is this called?</w:t>
       </w:r>
     </w:p>
     <w:p>
       <w:pPr>
-        <w:spacing w:before="0" w:after="40"/>
-      </w:pPr>
-      <w:r>
-        <w:rPr>
-          <w:rFonts w:ascii="Calibri" w:hAnsi="Calibri"/>
-          <w:b w:val="0"/>
-          <w:i w:val="0"/>
-          <w:color w:val="1A1A1A"/>
-          <w:sz w:val="24"/>
-        </w:rPr>
-        <w:t>Claim: ________________________________________</w:t>
-      </w:r>
-    </w:p>
-    <w:p>
-      <w:pPr>
-        <w:spacing w:before="0" w:after="40"/>
-      </w:pPr>
-      <w:r>
-        <w:rPr>
-          <w:rFonts w:ascii="Calibri" w:hAnsi="Calibri"/>
-          <w:b w:val="0"/>
-          <w:i w:val="0"/>
-          <w:color w:val="1A1A1A"/>
-          <w:sz w:val="24"/>
-        </w:rPr>
-        <w:t>Evidence: ______________________________________</w:t>
-      </w:r>
-    </w:p>
-    <w:p>
-      <w:pPr>
-        <w:spacing w:before="0" w:after="40"/>
-      </w:pPr>
-      <w:r>
-        <w:rPr>
-          <w:rFonts w:ascii="Calibri" w:hAnsi="Calibri"/>
-          <w:b w:val="0"/>
-          <w:i w:val="0"/>
-          <w:color w:val="1A1A1A"/>
-          <w:sz w:val="24"/>
-        </w:rPr>
-        <w:t>Reasoning: ______________________________________</w:t>
-      </w:r>
-    </w:p>
-    <w:p>
-      <w:pPr>
-        <w:spacing w:before="0" w:after="160"/>
-      </w:pPr>
-      <w:r>
-        <w:rPr>
-          <w:rFonts w:ascii="Calibri" w:hAnsi="Calibri"/>
-          <w:b w:val="0"/>
-          <w:i w:val="0"/>
-          <w:color w:val="1A1A1A"/>
-          <w:sz w:val="24"/>
-        </w:rPr>
-        <w:t xml:space="preserve">                                                            </w:t>
-      </w:r>
-    </w:p>
-    <w:p>
-      <w:pPr>
-        <w:spacing w:before="0" w:after="160"/>
-      </w:pPr>
-      <w:r>
-        <w:rPr>
-          <w:rFonts w:ascii="Calibri" w:hAnsi="Calibri"/>
-          <w:b w:val="0"/>
-          <w:i w:val="0"/>
-          <w:color w:val="1A1A1A"/>
-          <w:sz w:val="24"/>
-        </w:rPr>
-        <w:t xml:space="preserve">                                                            </w:t>
-      </w:r>
-    </w:p>
-    <w:p>
-      <w:pPr>
-        <w:spacing w:before="120" w:after="40"/>
+        <w:keepNext/>
+        <w:spacing w:after="40" w:before="0"/>
       </w:pPr>
       <w:r>
         <w:rPr>
           <w:rFonts w:ascii="Calibri" w:hAnsi="Calibri"/>
           <w:b/>
-          <w:i w:val="0"/>
-          <w:color w:val="1A1A1A"/>
-          <w:sz w:val="24"/>
+          <w:sz w:val="26"/>
         </w:rPr>
-        <w:t>24. Label the energy chain for a fan:</w:t>
+        <w:t xml:space="preserve">A. </w:t>
+      </w:r>
+      <w:r>
+        <w:rPr>
+          <w:rFonts w:ascii="Calibri" w:hAnsi="Calibri"/>
+          <w:b w:val="0"/>
+          <w:sz w:val="26"/>
+        </w:rPr>
+        <w:t>Stored energy</w:t>
       </w:r>
     </w:p>
     <w:p>
       <w:pPr>
-        <w:spacing w:before="0" w:after="40"/>
-      </w:pPr>
-      <w:r>
-        <w:rPr>
-          <w:rFonts w:ascii="Calibri" w:hAnsi="Calibri"/>
-          <w:b w:val="0"/>
-          <w:i w:val="0"/>
-          <w:color w:val="1A1A1A"/>
-          <w:sz w:val="24"/>
-        </w:rPr>
-        <w:t xml:space="preserve">    INPUT: electrical energy  →  TRANSFORMATION: ____________  →  OUTPUT: the fan spins</w:t>
-      </w:r>
-    </w:p>
-    <w:p>
-      <w:pPr>
-        <w:spacing w:before="160" w:after="40"/>
+        <w:keepNext/>
+        <w:spacing w:after="40" w:before="0"/>
       </w:pPr>
       <w:r>
         <w:rPr>
           <w:rFonts w:ascii="Calibri" w:hAnsi="Calibri"/>
           <w:b/>
-          <w:i w:val="0"/>
-          <w:color w:val="1F3A5F"/>
           <w:sz w:val="26"/>
         </w:rPr>
-        <w:t>Section 7 — Edison and Engineering Persistence</w:t>
+        <w:t xml:space="preserve">B. </w:t>
+      </w:r>
+      <w:r>
+        <w:rPr>
+          <w:rFonts w:ascii="Calibri" w:hAnsi="Calibri"/>
+          <w:b w:val="0"/>
+          <w:sz w:val="26"/>
+        </w:rPr>
+        <w:t>A transformation of light</w:t>
       </w:r>
     </w:p>
     <w:p>
       <w:pPr>
-        <w:spacing w:before="120" w:after="40"/>
+        <w:keepNext/>
+        <w:spacing w:after="40" w:before="0"/>
       </w:pPr>
       <w:r>
         <w:rPr>
           <w:rFonts w:ascii="Calibri" w:hAnsi="Calibri"/>
           <w:b/>
-          <w:i w:val="0"/>
-          <w:color w:val="1A1A1A"/>
-          <w:sz w:val="24"/>
+          <w:sz w:val="26"/>
         </w:rPr>
-        <w:t>25. What is TRUE about Thomas Edison and the light bulb?</w:t>
+        <w:t xml:space="preserve">C. </w:t>
+      </w:r>
+      <w:r>
+        <w:rPr>
+          <w:rFonts w:ascii="Calibri" w:hAnsi="Calibri"/>
+          <w:b w:val="0"/>
+          <w:sz w:val="26"/>
+        </w:rPr>
+        <w:t>Energy transfer</w:t>
       </w:r>
     </w:p>
     <w:p>
       <w:pPr>
-        <w:spacing w:before="0" w:after="20"/>
-      </w:pPr>
-      <w:r>
-        <w:rPr>
-          <w:rFonts w:ascii="Calibri" w:hAnsi="Calibri"/>
-          <w:b w:val="0"/>
-          <w:i w:val="0"/>
-          <w:color w:val="1A1A1A"/>
-          <w:sz w:val="24"/>
-        </w:rPr>
-        <w:t xml:space="preserve">    a) He invented the first light bulb all by himself</w:t>
-      </w:r>
-    </w:p>
-    <w:p>
-      <w:pPr>
-        <w:spacing w:before="0" w:after="20"/>
-      </w:pPr>
-      <w:r>
-        <w:rPr>
-          <w:rFonts w:ascii="Calibri" w:hAnsi="Calibri"/>
-          <w:b w:val="0"/>
-          <w:i w:val="0"/>
-          <w:color w:val="1A1A1A"/>
-          <w:sz w:val="24"/>
-        </w:rPr>
-        <w:t xml:space="preserve">    b) He improved earlier designs by testing and redesigning</w:t>
-      </w:r>
-    </w:p>
-    <w:p>
-      <w:pPr>
-        <w:spacing w:before="0" w:after="20"/>
-      </w:pPr>
-      <w:r>
-        <w:rPr>
-          <w:rFonts w:ascii="Calibri" w:hAnsi="Calibri"/>
-          <w:b w:val="0"/>
-          <w:i w:val="0"/>
-          <w:color w:val="1A1A1A"/>
-          <w:sz w:val="24"/>
-        </w:rPr>
-        <w:t xml:space="preserve">    c) He never tested any materials</w:t>
-      </w:r>
-    </w:p>
-    <w:p>
-      <w:pPr>
-        <w:spacing w:before="0" w:after="20"/>
-      </w:pPr>
-      <w:r>
-        <w:rPr>
-          <w:rFonts w:ascii="Calibri" w:hAnsi="Calibri"/>
-          <w:b w:val="0"/>
-          <w:i w:val="0"/>
-          <w:color w:val="1A1A1A"/>
-          <w:sz w:val="24"/>
-        </w:rPr>
-        <w:t xml:space="preserve">    d) He gave up after one try</w:t>
-      </w:r>
-    </w:p>
-    <w:p>
-      <w:pPr>
-        <w:spacing w:before="120" w:after="40"/>
+        <w:spacing w:after="40" w:before="0"/>
       </w:pPr>
       <w:r>
         <w:rPr>
           <w:rFonts w:ascii="Calibri" w:hAnsi="Calibri"/>
           <w:b/>
-          <w:i w:val="0"/>
-          <w:color w:val="1A1A1A"/>
-          <w:sz w:val="24"/>
+          <w:sz w:val="26"/>
         </w:rPr>
-        <w:t>26. How did Edison use TESTING and REDESIGN to solve problems? What does this show about persistence?</w:t>
+        <w:t xml:space="preserve">D. </w:t>
+      </w:r>
+      <w:r>
+        <w:rPr>
+          <w:rFonts w:ascii="Calibri" w:hAnsi="Calibri"/>
+          <w:b w:val="0"/>
+          <w:sz w:val="26"/>
+        </w:rPr>
+        <w:t>Energy of motion only</w:t>
       </w:r>
     </w:p>
     <w:p>
       <w:pPr>
-        <w:spacing w:before="0" w:after="160"/>
+        <w:keepNext/>
+        <w:spacing w:after="60" w:before="80"/>
       </w:pPr>
       <w:r>
         <w:rPr>
           <w:rFonts w:ascii="Calibri" w:hAnsi="Calibri"/>
+          <w:b/>
+          <w:sz w:val="27"/>
+        </w:rPr>
+        <w:t xml:space="preserve">14. </w:t>
+      </w:r>
+      <w:r>
+        <w:rPr>
+          <w:rFonts w:ascii="Calibri" w:hAnsi="Calibri"/>
           <w:b w:val="0"/>
-          <w:i w:val="0"/>
-          <w:color w:val="1A1A1A"/>
-          <w:sz w:val="24"/>
+          <w:sz w:val="27"/>
         </w:rPr>
-        <w:t xml:space="preserve">                                                            </w:t>
+        <w:t>Which of these is an example of an energy TRANSFORMATION?</w:t>
       </w:r>
     </w:p>
     <w:p>
       <w:pPr>
-        <w:spacing w:before="0" w:after="160"/>
+        <w:keepNext/>
+        <w:spacing w:after="40" w:before="0"/>
       </w:pPr>
       <w:r>
         <w:rPr>
           <w:rFonts w:ascii="Calibri" w:hAnsi="Calibri"/>
+          <w:b/>
+          <w:sz w:val="26"/>
+        </w:rPr>
+        <w:t xml:space="preserve">A. </w:t>
+      </w:r>
+      <w:r>
+        <w:rPr>
+          <w:rFonts w:ascii="Calibri" w:hAnsi="Calibri"/>
           <w:b w:val="0"/>
-          <w:i w:val="0"/>
-          <w:color w:val="1A1A1A"/>
-          <w:sz w:val="24"/>
+          <w:sz w:val="26"/>
         </w:rPr>
-        <w:t xml:space="preserve">                                                            </w:t>
+        <w:t>Energy moving from a warm cup to a cooler one</w:t>
       </w:r>
     </w:p>
     <w:p>
       <w:pPr>
-        <w:spacing w:before="0" w:after="160"/>
+        <w:keepNext/>
+        <w:spacing w:after="40" w:before="0"/>
       </w:pPr>
       <w:r>
         <w:rPr>
           <w:rFonts w:ascii="Calibri" w:hAnsi="Calibri"/>
+          <w:b/>
+          <w:sz w:val="26"/>
+        </w:rPr>
+        <w:t xml:space="preserve">B. </w:t>
+      </w:r>
+      <w:r>
+        <w:rPr>
+          <w:rFonts w:ascii="Calibri" w:hAnsi="Calibri"/>
           <w:b w:val="0"/>
-          <w:i w:val="0"/>
-          <w:color w:val="1A1A1A"/>
-          <w:sz w:val="24"/>
+          <w:sz w:val="26"/>
         </w:rPr>
-        <w:t xml:space="preserve">                                                            </w:t>
+        <w:t>A light bulb changing electrical energy into light</w:t>
       </w:r>
     </w:p>
     <w:p>
       <w:pPr>
-        <w:spacing w:before="0" w:after="160"/>
+        <w:keepNext/>
+        <w:spacing w:after="40" w:before="0"/>
       </w:pPr>
       <w:r>
         <w:rPr>
           <w:rFonts w:ascii="Calibri" w:hAnsi="Calibri"/>
+          <w:b/>
+          <w:sz w:val="26"/>
+        </w:rPr>
+        <w:t xml:space="preserve">C. </w:t>
+      </w:r>
+      <w:r>
+        <w:rPr>
+          <w:rFonts w:ascii="Calibri" w:hAnsi="Calibri"/>
           <w:b w:val="0"/>
-          <w:i w:val="0"/>
-          <w:color w:val="1A1A1A"/>
-          <w:sz w:val="24"/>
+          <w:sz w:val="26"/>
         </w:rPr>
-        <w:t xml:space="preserve">                                                            </w:t>
+        <w:t>A moving ball rolling across the floor</w:t>
       </w:r>
     </w:p>
     <w:p>
       <w:pPr>
-        <w:spacing w:before="160" w:after="80"/>
+        <w:spacing w:after="40" w:before="0"/>
       </w:pPr>
       <w:r>
         <w:rPr>
           <w:rFonts w:ascii="Calibri" w:hAnsi="Calibri"/>
+          <w:b/>
+          <w:sz w:val="26"/>
+        </w:rPr>
+        <w:t xml:space="preserve">D. </w:t>
+      </w:r>
+      <w:r>
+        <w:rPr>
+          <w:rFonts w:ascii="Calibri" w:hAnsi="Calibri"/>
           <w:b w:val="0"/>
-          <w:i/>
-          <w:color w:val="555555"/>
-          <w:sz w:val="24"/>
+          <w:sz w:val="26"/>
         </w:rPr>
-        <w:t>End of assessment.</w:t>
+        <w:t>Sound traveling through the air</w:t>
       </w:r>
     </w:p>
     <w:p>
       <w:pPr>
-        <w:spacing w:before="0" w:after="80"/>
+        <w:keepNext/>
+        <w:spacing w:after="60" w:before="80"/>
       </w:pPr>
       <w:r>
         <w:rPr>
           <w:rFonts w:ascii="Calibri" w:hAnsi="Calibri"/>
+          <w:b/>
+          <w:sz w:val="27"/>
+        </w:rPr>
+        <w:t xml:space="preserve">15. </w:t>
+      </w:r>
+      <w:r>
+        <w:rPr>
+          <w:rFonts w:ascii="Calibri" w:hAnsi="Calibri"/>
           <w:b w:val="0"/>
-          <w:i/>
-          <w:color w:val="555555"/>
-          <w:sz w:val="18"/>
+          <w:sz w:val="27"/>
         </w:rPr>
-        <w:t>Provenance: ADAPTED — original assessment aligned to the official Unit Assessment blueprint (50 pts), re-authored.</w:t>
+        <w:t>Students are building a tabletop signal device that must make a sound. They may use only the materials in their box. The rule that they may use only the materials in their box is a ____.</w:t>
+      </w:r>
+    </w:p>
+    <w:p>
+      <w:pPr>
+        <w:keepNext/>
+        <w:spacing w:after="40" w:before="0"/>
+      </w:pPr>
+      <w:r>
+        <w:rPr>
+          <w:rFonts w:ascii="Calibri" w:hAnsi="Calibri"/>
+          <w:b/>
+          <w:sz w:val="26"/>
+        </w:rPr>
+        <w:t xml:space="preserve">A. </w:t>
+      </w:r>
+      <w:r>
+        <w:rPr>
+          <w:rFonts w:ascii="Calibri" w:hAnsi="Calibri"/>
+          <w:b w:val="0"/>
+          <w:sz w:val="26"/>
+        </w:rPr>
+        <w:t>Constraint</w:t>
+      </w:r>
+    </w:p>
+    <w:p>
+      <w:pPr>
+        <w:keepNext/>
+        <w:spacing w:after="40" w:before="0"/>
+      </w:pPr>
+      <w:r>
+        <w:rPr>
+          <w:rFonts w:ascii="Calibri" w:hAnsi="Calibri"/>
+          <w:b/>
+          <w:sz w:val="26"/>
+        </w:rPr>
+        <w:t xml:space="preserve">B. </w:t>
+      </w:r>
+      <w:r>
+        <w:rPr>
+          <w:rFonts w:ascii="Calibri" w:hAnsi="Calibri"/>
+          <w:b w:val="0"/>
+          <w:sz w:val="26"/>
+        </w:rPr>
+        <w:t>Criterion</w:t>
+      </w:r>
+    </w:p>
+    <w:p>
+      <w:pPr>
+        <w:keepNext/>
+        <w:spacing w:after="40" w:before="0"/>
+      </w:pPr>
+      <w:r>
+        <w:rPr>
+          <w:rFonts w:ascii="Calibri" w:hAnsi="Calibri"/>
+          <w:b/>
+          <w:sz w:val="26"/>
+        </w:rPr>
+        <w:t xml:space="preserve">C. </w:t>
+      </w:r>
+      <w:r>
+        <w:rPr>
+          <w:rFonts w:ascii="Calibri" w:hAnsi="Calibri"/>
+          <w:b w:val="0"/>
+          <w:sz w:val="26"/>
+        </w:rPr>
+        <w:t>Transformation</w:t>
+      </w:r>
+    </w:p>
+    <w:p>
+      <w:pPr>
+        <w:spacing w:after="40" w:before="0"/>
+      </w:pPr>
+      <w:r>
+        <w:rPr>
+          <w:rFonts w:ascii="Calibri" w:hAnsi="Calibri"/>
+          <w:b/>
+          <w:sz w:val="26"/>
+        </w:rPr>
+        <w:t xml:space="preserve">D. </w:t>
+      </w:r>
+      <w:r>
+        <w:rPr>
+          <w:rFonts w:ascii="Calibri" w:hAnsi="Calibri"/>
+          <w:b w:val="0"/>
+          <w:sz w:val="26"/>
+        </w:rPr>
+        <w:t>Transfer</w:t>
+      </w:r>
+    </w:p>
+    <w:p>
+      <w:pPr>
+        <w:keepNext/>
+        <w:spacing w:after="60" w:before="80"/>
+      </w:pPr>
+      <w:r>
+        <w:rPr>
+          <w:rFonts w:ascii="Calibri" w:hAnsi="Calibri"/>
+          <w:b/>
+          <w:sz w:val="27"/>
+        </w:rPr>
+        <w:t xml:space="preserve">16. </w:t>
+      </w:r>
+      <w:r>
+        <w:rPr>
+          <w:rFonts w:ascii="Calibri" w:hAnsi="Calibri"/>
+          <w:b w:val="0"/>
+          <w:sz w:val="27"/>
+        </w:rPr>
+        <w:t>A student sees a light turn on and a fan begin to spin. How do we know energy was involved?</w:t>
+      </w:r>
+    </w:p>
+    <w:p>
+      <w:pPr>
+        <w:keepNext/>
+        <w:spacing w:after="40" w:before="0"/>
+      </w:pPr>
+      <w:r>
+        <w:rPr>
+          <w:rFonts w:ascii="Calibri" w:hAnsi="Calibri"/>
+          <w:b/>
+          <w:sz w:val="26"/>
+        </w:rPr>
+        <w:t xml:space="preserve">A. </w:t>
+      </w:r>
+      <w:r>
+        <w:rPr>
+          <w:rFonts w:ascii="Calibri" w:hAnsi="Calibri"/>
+          <w:b w:val="0"/>
+          <w:sz w:val="26"/>
+        </w:rPr>
+        <w:t>We can see energy itself moving</w:t>
+      </w:r>
+    </w:p>
+    <w:p>
+      <w:pPr>
+        <w:keepNext/>
+        <w:spacing w:after="40" w:before="0"/>
+      </w:pPr>
+      <w:r>
+        <w:rPr>
+          <w:rFonts w:ascii="Calibri" w:hAnsi="Calibri"/>
+          <w:b/>
+          <w:sz w:val="26"/>
+        </w:rPr>
+        <w:t xml:space="preserve">B. </w:t>
+      </w:r>
+      <w:r>
+        <w:rPr>
+          <w:rFonts w:ascii="Calibri" w:hAnsi="Calibri"/>
+          <w:b w:val="0"/>
+          <w:sz w:val="26"/>
+        </w:rPr>
+        <w:t>Energy is involved only when something makes a sound</w:t>
+      </w:r>
+    </w:p>
+    <w:p>
+      <w:pPr>
+        <w:keepNext/>
+        <w:spacing w:after="40" w:before="0"/>
+      </w:pPr>
+      <w:r>
+        <w:rPr>
+          <w:rFonts w:ascii="Calibri" w:hAnsi="Calibri"/>
+          <w:b/>
+          <w:sz w:val="26"/>
+        </w:rPr>
+        <w:t xml:space="preserve">C. </w:t>
+      </w:r>
+      <w:r>
+        <w:rPr>
+          <w:rFonts w:ascii="Calibri" w:hAnsi="Calibri"/>
+          <w:b w:val="0"/>
+          <w:sz w:val="26"/>
+        </w:rPr>
+        <w:t>The objects changed on their own without energy</w:t>
+      </w:r>
+    </w:p>
+    <w:p>
+      <w:pPr>
+        <w:spacing w:after="40" w:before="0"/>
+      </w:pPr>
+      <w:r>
+        <w:rPr>
+          <w:rFonts w:ascii="Calibri" w:hAnsi="Calibri"/>
+          <w:b/>
+          <w:sz w:val="26"/>
+        </w:rPr>
+        <w:t xml:space="preserve">D. </w:t>
+      </w:r>
+      <w:r>
+        <w:rPr>
+          <w:rFonts w:ascii="Calibri" w:hAnsi="Calibri"/>
+          <w:b w:val="0"/>
+          <w:sz w:val="26"/>
+        </w:rPr>
+        <w:t>We observe the changes and use them as evidence</w:t>
+      </w:r>
+    </w:p>
+    <w:p>
+      <w:pPr>
+        <w:keepNext/>
+        <w:spacing w:after="60" w:before="80"/>
+      </w:pPr>
+      <w:r>
+        <w:rPr>
+          <w:rFonts w:ascii="Calibri" w:hAnsi="Calibri"/>
+          <w:b/>
+          <w:sz w:val="27"/>
+        </w:rPr>
+        <w:t xml:space="preserve">17. </w:t>
+      </w:r>
+      <w:r>
+        <w:rPr>
+          <w:rFonts w:ascii="Calibri" w:hAnsi="Calibri"/>
+          <w:b w:val="0"/>
+          <w:sz w:val="27"/>
+        </w:rPr>
+        <w:t>Which of these shows energy transferring from one place to another?</w:t>
+      </w:r>
+    </w:p>
+    <w:p>
+      <w:pPr>
+        <w:keepNext/>
+        <w:spacing w:after="40" w:before="0"/>
+      </w:pPr>
+      <w:r>
+        <w:rPr>
+          <w:rFonts w:ascii="Calibri" w:hAnsi="Calibri"/>
+          <w:b/>
+          <w:sz w:val="26"/>
+        </w:rPr>
+        <w:t xml:space="preserve">A. </w:t>
+      </w:r>
+      <w:r>
+        <w:rPr>
+          <w:rFonts w:ascii="Calibri" w:hAnsi="Calibri"/>
+          <w:b w:val="0"/>
+          <w:sz w:val="26"/>
+        </w:rPr>
+        <w:t>A battery sitting unused in a drawer</w:t>
+      </w:r>
+    </w:p>
+    <w:p>
+      <w:pPr>
+        <w:keepNext/>
+        <w:spacing w:after="40" w:before="0"/>
+      </w:pPr>
+      <w:r>
+        <w:rPr>
+          <w:rFonts w:ascii="Calibri" w:hAnsi="Calibri"/>
+          <w:b/>
+          <w:sz w:val="26"/>
+        </w:rPr>
+        <w:t xml:space="preserve">B. </w:t>
+      </w:r>
+      <w:r>
+        <w:rPr>
+          <w:rFonts w:ascii="Calibri" w:hAnsi="Calibri"/>
+          <w:b w:val="0"/>
+          <w:sz w:val="26"/>
+        </w:rPr>
+        <w:t>A flashlight lighting a card across the room</w:t>
+      </w:r>
+    </w:p>
+    <w:p>
+      <w:pPr>
+        <w:keepNext/>
+        <w:spacing w:after="40" w:before="0"/>
+      </w:pPr>
+      <w:r>
+        <w:rPr>
+          <w:rFonts w:ascii="Calibri" w:hAnsi="Calibri"/>
+          <w:b/>
+          <w:sz w:val="26"/>
+        </w:rPr>
+        <w:t xml:space="preserve">C. </w:t>
+      </w:r>
+      <w:r>
+        <w:rPr>
+          <w:rFonts w:ascii="Calibri" w:hAnsi="Calibri"/>
+          <w:b w:val="0"/>
+          <w:sz w:val="26"/>
+        </w:rPr>
+        <w:t>A pencil lying still on a desk</w:t>
+      </w:r>
+    </w:p>
+    <w:p>
+      <w:pPr>
+        <w:spacing w:after="40" w:before="0"/>
+      </w:pPr>
+      <w:r>
+        <w:rPr>
+          <w:rFonts w:ascii="Calibri" w:hAnsi="Calibri"/>
+          <w:b/>
+          <w:sz w:val="26"/>
+        </w:rPr>
+        <w:t xml:space="preserve">D. </w:t>
+      </w:r>
+      <w:r>
+        <w:rPr>
+          <w:rFonts w:ascii="Calibri" w:hAnsi="Calibri"/>
+          <w:b w:val="0"/>
+          <w:sz w:val="26"/>
+        </w:rPr>
+        <w:t>A ball resting on the floor</w:t>
+      </w:r>
+    </w:p>
+    <w:p>
+      <w:pPr>
+        <w:keepNext/>
+        <w:spacing w:after="60" w:before="80"/>
+      </w:pPr>
+      <w:r>
+        <w:rPr>
+          <w:rFonts w:ascii="Calibri" w:hAnsi="Calibri"/>
+          <w:b/>
+          <w:sz w:val="27"/>
+        </w:rPr>
+        <w:t xml:space="preserve">18. </w:t>
+      </w:r>
+      <w:r>
+        <w:rPr>
+          <w:rFonts w:ascii="Calibri" w:hAnsi="Calibri"/>
+          <w:b w:val="0"/>
+          <w:sz w:val="27"/>
+        </w:rPr>
+        <w:t>Which object has stored energy that can cause a change later?</w:t>
+      </w:r>
+    </w:p>
+    <w:p>
+      <w:pPr>
+        <w:keepNext/>
+        <w:spacing w:after="40" w:before="0"/>
+      </w:pPr>
+      <w:r>
+        <w:rPr>
+          <w:rFonts w:ascii="Calibri" w:hAnsi="Calibri"/>
+          <w:b/>
+          <w:sz w:val="26"/>
+        </w:rPr>
+        <w:t xml:space="preserve">A. </w:t>
+      </w:r>
+      <w:r>
+        <w:rPr>
+          <w:rFonts w:ascii="Calibri" w:hAnsi="Calibri"/>
+          <w:b w:val="0"/>
+          <w:sz w:val="26"/>
+        </w:rPr>
+        <w:t>A ball that is already rolling across the floor</w:t>
+      </w:r>
+    </w:p>
+    <w:p>
+      <w:pPr>
+        <w:keepNext/>
+        <w:spacing w:after="40" w:before="0"/>
+      </w:pPr>
+      <w:r>
+        <w:rPr>
+          <w:rFonts w:ascii="Calibri" w:hAnsi="Calibri"/>
+          <w:b/>
+          <w:sz w:val="26"/>
+        </w:rPr>
+        <w:t xml:space="preserve">B. </w:t>
+      </w:r>
+      <w:r>
+        <w:rPr>
+          <w:rFonts w:ascii="Calibri" w:hAnsi="Calibri"/>
+          <w:b w:val="0"/>
+          <w:sz w:val="26"/>
+        </w:rPr>
+        <w:t>A cup that just stopped moving</w:t>
+      </w:r>
+    </w:p>
+    <w:p>
+      <w:pPr>
+        <w:keepNext/>
+        <w:spacing w:after="40" w:before="0"/>
+      </w:pPr>
+      <w:r>
+        <w:rPr>
+          <w:rFonts w:ascii="Calibri" w:hAnsi="Calibri"/>
+          <w:b/>
+          <w:sz w:val="26"/>
+        </w:rPr>
+        <w:t xml:space="preserve">C. </w:t>
+      </w:r>
+      <w:r>
+        <w:rPr>
+          <w:rFonts w:ascii="Calibri" w:hAnsi="Calibri"/>
+          <w:b w:val="0"/>
+          <w:sz w:val="26"/>
+        </w:rPr>
+        <w:t>A stretched rubber band ready to snap</w:t>
+      </w:r>
+    </w:p>
+    <w:p>
+      <w:pPr>
+        <w:spacing w:after="40" w:before="0"/>
+      </w:pPr>
+      <w:r>
+        <w:rPr>
+          <w:rFonts w:ascii="Calibri" w:hAnsi="Calibri"/>
+          <w:b/>
+          <w:sz w:val="26"/>
+        </w:rPr>
+        <w:t xml:space="preserve">D. </w:t>
+      </w:r>
+      <w:r>
+        <w:rPr>
+          <w:rFonts w:ascii="Calibri" w:hAnsi="Calibri"/>
+          <w:b w:val="0"/>
+          <w:sz w:val="26"/>
+        </w:rPr>
+        <w:t>A paper that already fell to the ground</w:t>
+      </w:r>
+    </w:p>
+    <w:p>
+      <w:pPr>
+        <w:keepNext/>
+        <w:spacing w:after="60" w:before="80"/>
+      </w:pPr>
+      <w:r>
+        <w:rPr>
+          <w:rFonts w:ascii="Calibri" w:hAnsi="Calibri"/>
+          <w:b/>
+          <w:sz w:val="27"/>
+        </w:rPr>
+        <w:t xml:space="preserve">19. </w:t>
+      </w:r>
+      <w:r>
+        <w:rPr>
+          <w:rFonts w:ascii="Calibri" w:hAnsi="Calibri"/>
+          <w:b w:val="0"/>
+          <w:sz w:val="27"/>
+        </w:rPr>
+        <w:t>A car drives slowly through a parking lot and then fast on a highway. When does the car have more energy of motion?</w:t>
+      </w:r>
+    </w:p>
+    <w:p>
+      <w:pPr>
+        <w:keepNext/>
+        <w:spacing w:after="40" w:before="0"/>
+      </w:pPr>
+      <w:r>
+        <w:rPr>
+          <w:rFonts w:ascii="Calibri" w:hAnsi="Calibri"/>
+          <w:b/>
+          <w:sz w:val="26"/>
+        </w:rPr>
+        <w:t xml:space="preserve">A. </w:t>
+      </w:r>
+      <w:r>
+        <w:rPr>
+          <w:rFonts w:ascii="Calibri" w:hAnsi="Calibri"/>
+          <w:b w:val="0"/>
+          <w:sz w:val="26"/>
+        </w:rPr>
+        <w:t>When it is moving fast</w:t>
+      </w:r>
+    </w:p>
+    <w:p>
+      <w:pPr>
+        <w:keepNext/>
+        <w:spacing w:after="40" w:before="0"/>
+      </w:pPr>
+      <w:r>
+        <w:rPr>
+          <w:rFonts w:ascii="Calibri" w:hAnsi="Calibri"/>
+          <w:b/>
+          <w:sz w:val="26"/>
+        </w:rPr>
+        <w:t xml:space="preserve">B. </w:t>
+      </w:r>
+      <w:r>
+        <w:rPr>
+          <w:rFonts w:ascii="Calibri" w:hAnsi="Calibri"/>
+          <w:b w:val="0"/>
+          <w:sz w:val="26"/>
+        </w:rPr>
+        <w:t>When it is moving slowly</w:t>
+      </w:r>
+    </w:p>
+    <w:p>
+      <w:pPr>
+        <w:keepNext/>
+        <w:spacing w:after="40" w:before="0"/>
+      </w:pPr>
+      <w:r>
+        <w:rPr>
+          <w:rFonts w:ascii="Calibri" w:hAnsi="Calibri"/>
+          <w:b/>
+          <w:sz w:val="26"/>
+        </w:rPr>
+        <w:t xml:space="preserve">C. </w:t>
+      </w:r>
+      <w:r>
+        <w:rPr>
+          <w:rFonts w:ascii="Calibri" w:hAnsi="Calibri"/>
+          <w:b w:val="0"/>
+          <w:sz w:val="26"/>
+        </w:rPr>
+        <w:t>The car has the same energy of motion the whole time</w:t>
+      </w:r>
+    </w:p>
+    <w:p>
+      <w:pPr>
+        <w:spacing w:after="40" w:before="0"/>
+      </w:pPr>
+      <w:r>
+        <w:rPr>
+          <w:rFonts w:ascii="Calibri" w:hAnsi="Calibri"/>
+          <w:b/>
+          <w:sz w:val="26"/>
+        </w:rPr>
+        <w:t xml:space="preserve">D. </w:t>
+      </w:r>
+      <w:r>
+        <w:rPr>
+          <w:rFonts w:ascii="Calibri" w:hAnsi="Calibri"/>
+          <w:b w:val="0"/>
+          <w:sz w:val="26"/>
+        </w:rPr>
+        <w:t>The car has no energy of motion on the highway</w:t>
+      </w:r>
+    </w:p>
+    <w:p>
+      <w:pPr>
+        <w:keepNext/>
+        <w:spacing w:after="80"/>
+        <w:jc w:val="center"/>
+      </w:pPr>
+      <w:r>
+        <w:drawing>
+          <wp:inline xmlns:a="http://schemas.openxmlformats.org/drawingml/2006/main" xmlns:pic="http://schemas.openxmlformats.org/drawingml/2006/picture">
+            <wp:extent cx="3657600" cy="1097280"/>
+            <wp:docPr id="4" name="Picture 4"/>
+            <wp:cNvGraphicFramePr>
+              <a:graphicFrameLocks noChangeAspect="1"/>
+            </wp:cNvGraphicFramePr>
+            <a:graphic>
+              <a:graphicData uri="http://schemas.openxmlformats.org/drawingml/2006/picture">
+                <pic:pic>
+                  <pic:nvPicPr>
+                    <pic:cNvPr id="0" name="flashlight.png"/>
+                    <pic:cNvPicPr/>
+                  </pic:nvPicPr>
+                  <pic:blipFill>
+                    <a:blip r:embed="rId12"/>
+                    <a:stretch>
+                      <a:fillRect/>
+                    </a:stretch>
+                  </pic:blipFill>
+                  <pic:spPr>
+                    <a:xfrm>
+                      <a:off x="0" y="0"/>
+                      <a:ext cx="3657600" cy="1097280"/>
+                    </a:xfrm>
+                    <a:prstGeom prst="rect"/>
+                  </pic:spPr>
+                </pic:pic>
+              </a:graphicData>
+            </a:graphic>
+          </wp:inline>
+        </w:drawing>
+      </w:r>
+    </w:p>
+    <w:p>
+      <w:pPr>
+        <w:keepNext/>
+        <w:spacing w:after="60" w:before="80"/>
+      </w:pPr>
+      <w:r>
+        <w:rPr>
+          <w:rFonts w:ascii="Calibri" w:hAnsi="Calibri"/>
+          <w:b/>
+          <w:sz w:val="27"/>
+        </w:rPr>
+        <w:t xml:space="preserve">20. </w:t>
+      </w:r>
+      <w:r>
+        <w:rPr>
+          <w:rFonts w:ascii="Calibri" w:hAnsi="Calibri"/>
+          <w:b w:val="0"/>
+          <w:sz w:val="27"/>
+        </w:rPr>
+        <w:t>A flashlight changes stored energy in the battery into light. At the same time, energy moves through the wires to the bulb. Which is happening?</w:t>
+      </w:r>
+    </w:p>
+    <w:p>
+      <w:pPr>
+        <w:keepNext/>
+        <w:spacing w:after="40" w:before="0"/>
+      </w:pPr>
+      <w:r>
+        <w:rPr>
+          <w:rFonts w:ascii="Calibri" w:hAnsi="Calibri"/>
+          <w:b/>
+          <w:sz w:val="26"/>
+        </w:rPr>
+        <w:t xml:space="preserve">A. </w:t>
+      </w:r>
+      <w:r>
+        <w:rPr>
+          <w:rFonts w:ascii="Calibri" w:hAnsi="Calibri"/>
+          <w:b w:val="0"/>
+          <w:sz w:val="26"/>
+        </w:rPr>
+        <w:t>Transfer only</w:t>
+      </w:r>
+    </w:p>
+    <w:p>
+      <w:pPr>
+        <w:keepNext/>
+        <w:spacing w:after="40" w:before="0"/>
+      </w:pPr>
+      <w:r>
+        <w:rPr>
+          <w:rFonts w:ascii="Calibri" w:hAnsi="Calibri"/>
+          <w:b/>
+          <w:sz w:val="26"/>
+        </w:rPr>
+        <w:t xml:space="preserve">B. </w:t>
+      </w:r>
+      <w:r>
+        <w:rPr>
+          <w:rFonts w:ascii="Calibri" w:hAnsi="Calibri"/>
+          <w:b w:val="0"/>
+          <w:sz w:val="26"/>
+        </w:rPr>
+        <w:t>Transformation only</w:t>
+      </w:r>
+    </w:p>
+    <w:p>
+      <w:pPr>
+        <w:keepNext/>
+        <w:spacing w:after="40" w:before="0"/>
+      </w:pPr>
+      <w:r>
+        <w:rPr>
+          <w:rFonts w:ascii="Calibri" w:hAnsi="Calibri"/>
+          <w:b/>
+          <w:sz w:val="26"/>
+        </w:rPr>
+        <w:t xml:space="preserve">C. </w:t>
+      </w:r>
+      <w:r>
+        <w:rPr>
+          <w:rFonts w:ascii="Calibri" w:hAnsi="Calibri"/>
+          <w:b w:val="0"/>
+          <w:sz w:val="26"/>
+        </w:rPr>
+        <w:t>Neither transfer nor transformation</w:t>
+      </w:r>
+    </w:p>
+    <w:p>
+      <w:pPr>
+        <w:spacing w:after="40" w:before="0"/>
+      </w:pPr>
+      <w:r>
+        <w:rPr>
+          <w:rFonts w:ascii="Calibri" w:hAnsi="Calibri"/>
+          <w:b/>
+          <w:sz w:val="26"/>
+        </w:rPr>
+        <w:t xml:space="preserve">D. </w:t>
+      </w:r>
+      <w:r>
+        <w:rPr>
+          <w:rFonts w:ascii="Calibri" w:hAnsi="Calibri"/>
+          <w:b w:val="0"/>
+          <w:sz w:val="26"/>
+        </w:rPr>
+        <w:t>Both transfer and transformation</w:t>
+      </w:r>
+    </w:p>
+    <w:p>
+      <w:pPr>
+        <w:keepNext/>
+        <w:spacing w:after="60" w:before="80"/>
+      </w:pPr>
+      <w:r>
+        <w:rPr>
+          <w:rFonts w:ascii="Calibri" w:hAnsi="Calibri"/>
+          <w:b/>
+          <w:sz w:val="27"/>
+        </w:rPr>
+        <w:t xml:space="preserve">21. </w:t>
+      </w:r>
+      <w:r>
+        <w:rPr>
+          <w:rFonts w:ascii="Calibri" w:hAnsi="Calibri"/>
+          <w:b w:val="0"/>
+          <w:sz w:val="27"/>
+        </w:rPr>
+        <w:t>A student rolls the SAME ball down a low ramp and then down a higher ramp. The cup moves farther when the ball comes down the higher ramp. Which conclusion is best supported?</w:t>
+      </w:r>
+    </w:p>
+    <w:p>
+      <w:pPr>
+        <w:keepNext/>
+        <w:spacing w:after="40" w:before="0"/>
+      </w:pPr>
+      <w:r>
+        <w:rPr>
+          <w:rFonts w:ascii="Calibri" w:hAnsi="Calibri"/>
+          <w:b/>
+          <w:sz w:val="26"/>
+        </w:rPr>
+        <w:t xml:space="preserve">A. </w:t>
+      </w:r>
+      <w:r>
+        <w:rPr>
+          <w:rFonts w:ascii="Calibri" w:hAnsi="Calibri"/>
+          <w:b w:val="0"/>
+          <w:sz w:val="26"/>
+        </w:rPr>
+        <w:t>The ball became heavier on the higher ramp</w:t>
+      </w:r>
+    </w:p>
+    <w:p>
+      <w:pPr>
+        <w:keepNext/>
+        <w:spacing w:after="40" w:before="0"/>
+      </w:pPr>
+      <w:r>
+        <w:rPr>
+          <w:rFonts w:ascii="Calibri" w:hAnsi="Calibri"/>
+          <w:b/>
+          <w:sz w:val="26"/>
+        </w:rPr>
+        <w:t xml:space="preserve">B. </w:t>
+      </w:r>
+      <w:r>
+        <w:rPr>
+          <w:rFonts w:ascii="Calibri" w:hAnsi="Calibri"/>
+          <w:b w:val="0"/>
+          <w:sz w:val="26"/>
+        </w:rPr>
+        <w:t>The ball had more energy of motion when it moved faster from the higher ramp</w:t>
+      </w:r>
+    </w:p>
+    <w:p>
+      <w:pPr>
+        <w:keepNext/>
+        <w:spacing w:after="40" w:before="0"/>
+      </w:pPr>
+      <w:r>
+        <w:rPr>
+          <w:rFonts w:ascii="Calibri" w:hAnsi="Calibri"/>
+          <w:b/>
+          <w:sz w:val="26"/>
+        </w:rPr>
+        <w:t xml:space="preserve">C. </w:t>
+      </w:r>
+      <w:r>
+        <w:rPr>
+          <w:rFonts w:ascii="Calibri" w:hAnsi="Calibri"/>
+          <w:b w:val="0"/>
+          <w:sz w:val="26"/>
+        </w:rPr>
+        <w:t>The cup changed on its own</w:t>
+      </w:r>
+    </w:p>
+    <w:p>
+      <w:pPr>
+        <w:spacing w:after="40" w:before="0"/>
+      </w:pPr>
+      <w:r>
+        <w:rPr>
+          <w:rFonts w:ascii="Calibri" w:hAnsi="Calibri"/>
+          <w:b/>
+          <w:sz w:val="26"/>
+        </w:rPr>
+        <w:t xml:space="preserve">D. </w:t>
+      </w:r>
+      <w:r>
+        <w:rPr>
+          <w:rFonts w:ascii="Calibri" w:hAnsi="Calibri"/>
+          <w:b w:val="0"/>
+          <w:sz w:val="26"/>
+        </w:rPr>
+        <w:t>Ramp height does not change the ball's energy of motion</w:t>
+      </w:r>
+    </w:p>
+    <w:p>
+      <w:pPr>
+        <w:keepNext/>
+        <w:spacing w:after="80"/>
+        <w:jc w:val="center"/>
+      </w:pPr>
+      <w:r>
+        <w:drawing>
+          <wp:inline xmlns:a="http://schemas.openxmlformats.org/drawingml/2006/main" xmlns:pic="http://schemas.openxmlformats.org/drawingml/2006/picture">
+            <wp:extent cx="3291840" cy="1188720"/>
+            <wp:docPr id="5" name="Picture 5"/>
+            <wp:cNvGraphicFramePr>
+              <a:graphicFrameLocks noChangeAspect="1"/>
+            </wp:cNvGraphicFramePr>
+            <a:graphic>
+              <a:graphicData uri="http://schemas.openxmlformats.org/drawingml/2006/picture">
+                <pic:pic>
+                  <pic:nvPicPr>
+                    <pic:cNvPr id="0" name="cycle.png"/>
+                    <pic:cNvPicPr/>
+                  </pic:nvPicPr>
+                  <pic:blipFill>
+                    <a:blip r:embed="rId13"/>
+                    <a:stretch>
+                      <a:fillRect/>
+                    </a:stretch>
+                  </pic:blipFill>
+                  <pic:spPr>
+                    <a:xfrm>
+                      <a:off x="0" y="0"/>
+                      <a:ext cx="3291840" cy="1188720"/>
+                    </a:xfrm>
+                    <a:prstGeom prst="rect"/>
+                  </pic:spPr>
+                </pic:pic>
+              </a:graphicData>
+            </a:graphic>
+          </wp:inline>
+        </w:drawing>
+      </w:r>
+    </w:p>
+    <w:p>
+      <w:pPr>
+        <w:keepNext/>
+        <w:spacing w:after="60" w:before="80"/>
+      </w:pPr>
+      <w:r>
+        <w:rPr>
+          <w:rFonts w:ascii="Calibri" w:hAnsi="Calibri"/>
+          <w:b/>
+          <w:sz w:val="27"/>
+        </w:rPr>
+        <w:t xml:space="preserve">22. </w:t>
+      </w:r>
+      <w:r>
+        <w:rPr>
+          <w:rFonts w:ascii="Calibri" w:hAnsi="Calibri"/>
+          <w:b w:val="0"/>
+          <w:sz w:val="27"/>
+        </w:rPr>
+        <w:t>An engineer builds a design, tests it, and sees that it does not work well. What should the engineer do next?</w:t>
+      </w:r>
+    </w:p>
+    <w:p>
+      <w:pPr>
+        <w:keepNext/>
+        <w:spacing w:after="40" w:before="0"/>
+      </w:pPr>
+      <w:r>
+        <w:rPr>
+          <w:rFonts w:ascii="Calibri" w:hAnsi="Calibri"/>
+          <w:b/>
+          <w:sz w:val="26"/>
+        </w:rPr>
+        <w:t xml:space="preserve">A. </w:t>
+      </w:r>
+      <w:r>
+        <w:rPr>
+          <w:rFonts w:ascii="Calibri" w:hAnsi="Calibri"/>
+          <w:b w:val="0"/>
+          <w:sz w:val="26"/>
+        </w:rPr>
+        <w:t>Use the test result as information to improve the design and test again</w:t>
+      </w:r>
+    </w:p>
+    <w:p>
+      <w:pPr>
+        <w:keepNext/>
+        <w:spacing w:after="40" w:before="0"/>
+      </w:pPr>
+      <w:r>
+        <w:rPr>
+          <w:rFonts w:ascii="Calibri" w:hAnsi="Calibri"/>
+          <w:b/>
+          <w:sz w:val="26"/>
+        </w:rPr>
+        <w:t xml:space="preserve">B. </w:t>
+      </w:r>
+      <w:r>
+        <w:rPr>
+          <w:rFonts w:ascii="Calibri" w:hAnsi="Calibri"/>
+          <w:b w:val="0"/>
+          <w:sz w:val="26"/>
+        </w:rPr>
+        <w:t>Give up, because a failed test means the design is useless</w:t>
+      </w:r>
+    </w:p>
+    <w:p>
+      <w:pPr>
+        <w:keepNext/>
+        <w:spacing w:after="40" w:before="0"/>
+      </w:pPr>
+      <w:r>
+        <w:rPr>
+          <w:rFonts w:ascii="Calibri" w:hAnsi="Calibri"/>
+          <w:b/>
+          <w:sz w:val="26"/>
+        </w:rPr>
+        <w:t xml:space="preserve">C. </w:t>
+      </w:r>
+      <w:r>
+        <w:rPr>
+          <w:rFonts w:ascii="Calibri" w:hAnsi="Calibri"/>
+          <w:b w:val="0"/>
+          <w:sz w:val="26"/>
+        </w:rPr>
+        <w:t>Ignore the test result and keep the design the same</w:t>
+      </w:r>
+    </w:p>
+    <w:p>
+      <w:pPr>
+        <w:spacing w:after="40" w:before="0"/>
+      </w:pPr>
+      <w:r>
+        <w:rPr>
+          <w:rFonts w:ascii="Calibri" w:hAnsi="Calibri"/>
+          <w:b/>
+          <w:sz w:val="26"/>
+        </w:rPr>
+        <w:t xml:space="preserve">D. </w:t>
+      </w:r>
+      <w:r>
+        <w:rPr>
+          <w:rFonts w:ascii="Calibri" w:hAnsi="Calibri"/>
+          <w:b w:val="0"/>
+          <w:sz w:val="26"/>
+        </w:rPr>
+        <w:t>Remove the test result from the notebook</w:t>
+      </w:r>
+    </w:p>
+    <w:p>
+      <w:pPr>
+        <w:keepNext/>
+        <w:spacing w:after="60" w:before="80"/>
+      </w:pPr>
+      <w:r>
+        <w:rPr>
+          <w:rFonts w:ascii="Calibri" w:hAnsi="Calibri"/>
+          <w:b/>
+          <w:sz w:val="27"/>
+        </w:rPr>
+        <w:t xml:space="preserve">23. </w:t>
+      </w:r>
+      <w:r>
+        <w:rPr>
+          <w:rFonts w:ascii="Calibri" w:hAnsi="Calibri"/>
+          <w:b w:val="0"/>
+          <w:sz w:val="27"/>
+        </w:rPr>
+        <w:t>A moving marble hits a still marble. The still marble rolls away. Which conclusion is best supported?</w:t>
+      </w:r>
+    </w:p>
+    <w:p>
+      <w:pPr>
+        <w:keepNext/>
+        <w:spacing w:after="40" w:before="0"/>
+      </w:pPr>
+      <w:r>
+        <w:rPr>
+          <w:rFonts w:ascii="Calibri" w:hAnsi="Calibri"/>
+          <w:b/>
+          <w:sz w:val="26"/>
+        </w:rPr>
+        <w:t xml:space="preserve">A. </w:t>
+      </w:r>
+      <w:r>
+        <w:rPr>
+          <w:rFonts w:ascii="Calibri" w:hAnsi="Calibri"/>
+          <w:b w:val="0"/>
+          <w:sz w:val="26"/>
+        </w:rPr>
+        <w:t>The still marble created its own energy</w:t>
+      </w:r>
+    </w:p>
+    <w:p>
+      <w:pPr>
+        <w:keepNext/>
+        <w:spacing w:after="40" w:before="0"/>
+      </w:pPr>
+      <w:r>
+        <w:rPr>
+          <w:rFonts w:ascii="Calibri" w:hAnsi="Calibri"/>
+          <w:b/>
+          <w:sz w:val="26"/>
+        </w:rPr>
+        <w:t xml:space="preserve">B. </w:t>
+      </w:r>
+      <w:r>
+        <w:rPr>
+          <w:rFonts w:ascii="Calibri" w:hAnsi="Calibri"/>
+          <w:b w:val="0"/>
+          <w:sz w:val="26"/>
+        </w:rPr>
+        <w:t>The moving marble's energy disappeared</w:t>
+      </w:r>
+    </w:p>
+    <w:p>
+      <w:pPr>
+        <w:keepNext/>
+        <w:spacing w:after="40" w:before="0"/>
+      </w:pPr>
+      <w:r>
+        <w:rPr>
+          <w:rFonts w:ascii="Calibri" w:hAnsi="Calibri"/>
+          <w:b/>
+          <w:sz w:val="26"/>
+        </w:rPr>
+        <w:t xml:space="preserve">C. </w:t>
+      </w:r>
+      <w:r>
+        <w:rPr>
+          <w:rFonts w:ascii="Calibri" w:hAnsi="Calibri"/>
+          <w:b w:val="0"/>
+          <w:sz w:val="26"/>
+        </w:rPr>
+        <w:t>Energy of motion transferred from the moving marble to the still marble</w:t>
+      </w:r>
+    </w:p>
+    <w:p>
+      <w:pPr>
+        <w:spacing w:after="40" w:before="0"/>
+      </w:pPr>
+      <w:r>
+        <w:rPr>
+          <w:rFonts w:ascii="Calibri" w:hAnsi="Calibri"/>
+          <w:b/>
+          <w:sz w:val="26"/>
+        </w:rPr>
+        <w:t xml:space="preserve">D. </w:t>
+      </w:r>
+      <w:r>
+        <w:rPr>
+          <w:rFonts w:ascii="Calibri" w:hAnsi="Calibri"/>
+          <w:b w:val="0"/>
+          <w:sz w:val="26"/>
+        </w:rPr>
+        <w:t>No energy was involved</w:t>
+      </w:r>
+    </w:p>
+    <w:p>
+      <w:pPr>
+        <w:keepNext/>
+        <w:spacing w:after="60" w:before="80"/>
+      </w:pPr>
+      <w:r>
+        <w:rPr>
+          <w:rFonts w:ascii="Calibri" w:hAnsi="Calibri"/>
+          <w:b/>
+          <w:sz w:val="27"/>
+        </w:rPr>
+        <w:t xml:space="preserve">24. </w:t>
+      </w:r>
+      <w:r>
+        <w:rPr>
+          <w:rFonts w:ascii="Calibri" w:hAnsi="Calibri"/>
+          <w:b w:val="0"/>
+          <w:sz w:val="27"/>
+        </w:rPr>
+        <w:t>Which sentence about Thomas Edison is true?</w:t>
+      </w:r>
+    </w:p>
+    <w:p>
+      <w:pPr>
+        <w:keepNext/>
+        <w:spacing w:after="40" w:before="0"/>
+      </w:pPr>
+      <w:r>
+        <w:rPr>
+          <w:rFonts w:ascii="Calibri" w:hAnsi="Calibri"/>
+          <w:b/>
+          <w:sz w:val="26"/>
+        </w:rPr>
+        <w:t xml:space="preserve">A. </w:t>
+      </w:r>
+      <w:r>
+        <w:rPr>
+          <w:rFonts w:ascii="Calibri" w:hAnsi="Calibri"/>
+          <w:b w:val="0"/>
+          <w:sz w:val="26"/>
+        </w:rPr>
+        <w:t>Edison invented the very first light bulb</w:t>
+      </w:r>
+    </w:p>
+    <w:p>
+      <w:pPr>
+        <w:keepNext/>
+        <w:spacing w:after="40" w:before="0"/>
+      </w:pPr>
+      <w:r>
+        <w:rPr>
+          <w:rFonts w:ascii="Calibri" w:hAnsi="Calibri"/>
+          <w:b/>
+          <w:sz w:val="26"/>
+        </w:rPr>
+        <w:t xml:space="preserve">B. </w:t>
+      </w:r>
+      <w:r>
+        <w:rPr>
+          <w:rFonts w:ascii="Calibri" w:hAnsi="Calibri"/>
+          <w:b w:val="0"/>
+          <w:sz w:val="26"/>
+        </w:rPr>
+        <w:t>Edison worked completely alone and never tested his ideas</w:t>
+      </w:r>
+    </w:p>
+    <w:p>
+      <w:pPr>
+        <w:keepNext/>
+        <w:spacing w:after="40" w:before="0"/>
+      </w:pPr>
+      <w:r>
+        <w:rPr>
+          <w:rFonts w:ascii="Calibri" w:hAnsi="Calibri"/>
+          <w:b/>
+          <w:sz w:val="26"/>
+        </w:rPr>
+        <w:t xml:space="preserve">C. </w:t>
+      </w:r>
+      <w:r>
+        <w:rPr>
+          <w:rFonts w:ascii="Calibri" w:hAnsi="Calibri"/>
+          <w:b w:val="0"/>
+          <w:sz w:val="26"/>
+        </w:rPr>
+        <w:t>Edison's bulb never needed to be improved by anyone else</w:t>
+      </w:r>
+    </w:p>
+    <w:p>
+      <w:pPr>
+        <w:spacing w:after="40" w:before="0"/>
+      </w:pPr>
+      <w:r>
+        <w:rPr>
+          <w:rFonts w:ascii="Calibri" w:hAnsi="Calibri"/>
+          <w:b/>
+          <w:sz w:val="26"/>
+        </w:rPr>
+        <w:t xml:space="preserve">D. </w:t>
+      </w:r>
+      <w:r>
+        <w:rPr>
+          <w:rFonts w:ascii="Calibri" w:hAnsi="Calibri"/>
+          <w:b w:val="0"/>
+          <w:sz w:val="26"/>
+        </w:rPr>
+        <w:t>Edison improved earlier light bulb designs and tested many materials</w:t>
+      </w:r>
+    </w:p>
+    <w:p>
+      <w:pPr>
+        <w:keepNext/>
+        <w:spacing w:after="60" w:before="80"/>
+      </w:pPr>
+      <w:r>
+        <w:rPr>
+          <w:rFonts w:ascii="Calibri" w:hAnsi="Calibri"/>
+          <w:b/>
+          <w:sz w:val="27"/>
+        </w:rPr>
+        <w:t xml:space="preserve">25. </w:t>
+      </w:r>
+      <w:r>
+        <w:rPr>
+          <w:rFonts w:ascii="Calibri" w:hAnsi="Calibri"/>
+          <w:b w:val="0"/>
+          <w:sz w:val="27"/>
+        </w:rPr>
+        <w:t>Warm water is placed next to a cooler cup. Soon the cooler cup feels warmer. What happened?</w:t>
+      </w:r>
+    </w:p>
+    <w:p>
+      <w:pPr>
+        <w:keepNext/>
+        <w:spacing w:after="40" w:before="0"/>
+      </w:pPr>
+      <w:r>
+        <w:rPr>
+          <w:rFonts w:ascii="Calibri" w:hAnsi="Calibri"/>
+          <w:b/>
+          <w:sz w:val="26"/>
+        </w:rPr>
+        <w:t xml:space="preserve">A. </w:t>
+      </w:r>
+      <w:r>
+        <w:rPr>
+          <w:rFonts w:ascii="Calibri" w:hAnsi="Calibri"/>
+          <w:b w:val="0"/>
+          <w:sz w:val="26"/>
+        </w:rPr>
+        <w:t>Energy transferred from the warm water to the cooler cup</w:t>
+      </w:r>
+    </w:p>
+    <w:p>
+      <w:pPr>
+        <w:keepNext/>
+        <w:spacing w:after="40" w:before="0"/>
+      </w:pPr>
+      <w:r>
+        <w:rPr>
+          <w:rFonts w:ascii="Calibri" w:hAnsi="Calibri"/>
+          <w:b/>
+          <w:sz w:val="26"/>
+        </w:rPr>
+        <w:t xml:space="preserve">B. </w:t>
+      </w:r>
+      <w:r>
+        <w:rPr>
+          <w:rFonts w:ascii="Calibri" w:hAnsi="Calibri"/>
+          <w:b w:val="0"/>
+          <w:sz w:val="26"/>
+        </w:rPr>
+        <w:t>Energy transferred from the cooler cup to the warm water</w:t>
+      </w:r>
+    </w:p>
+    <w:p>
+      <w:pPr>
+        <w:keepNext/>
+        <w:spacing w:after="40" w:before="0"/>
+      </w:pPr>
+      <w:r>
+        <w:rPr>
+          <w:rFonts w:ascii="Calibri" w:hAnsi="Calibri"/>
+          <w:b/>
+          <w:sz w:val="26"/>
+        </w:rPr>
+        <w:t xml:space="preserve">C. </w:t>
+      </w:r>
+      <w:r>
+        <w:rPr>
+          <w:rFonts w:ascii="Calibri" w:hAnsi="Calibri"/>
+          <w:b w:val="0"/>
+          <w:sz w:val="26"/>
+        </w:rPr>
+        <w:t>The cooler cup made its own heat</w:t>
+      </w:r>
+    </w:p>
+    <w:p>
+      <w:pPr>
+        <w:spacing w:after="40" w:before="0"/>
+      </w:pPr>
+      <w:r>
+        <w:rPr>
+          <w:rFonts w:ascii="Calibri" w:hAnsi="Calibri"/>
+          <w:b/>
+          <w:sz w:val="26"/>
+        </w:rPr>
+        <w:t xml:space="preserve">D. </w:t>
+      </w:r>
+      <w:r>
+        <w:rPr>
+          <w:rFonts w:ascii="Calibri" w:hAnsi="Calibri"/>
+          <w:b w:val="0"/>
+          <w:sz w:val="26"/>
+        </w:rPr>
+        <w:t>No energy moved at all</w:t>
       </w:r>
     </w:p>
     <w:sectPr>
       <w:pgSz w:w="12240" w:h="15840"/>
-      <w:pgMar w:top="720" w:right="864" w:bottom="720" w:left="864" w:header="720" w:footer="720" w:gutter="0"/>
+      <w:pgMar w:top="1008" w:right="1152" w:bottom="1008" w:left="1152" w:header="720" w:footer="720" w:gutter="0"/>
       <w:cols w:space="720"/>
       <w:docGrid w:linePitch="360"/>
     </w:sectPr>

</xml_diff>